<commit_message>
cambios finales punto 3
</commit_message>
<xml_diff>
--- a/Documentos/Proyecto1-LCJ-DocumentoFinal.docx
+++ b/Documentos/Proyecto1-LCJ-DocumentoFinal.docx
@@ -2,7 +2,10 @@
 <file path=word/document.xml><?xml version="1.0" encoding="utf-8"?>
 <w:document xmlns:wpc="http://schemas.microsoft.com/office/word/2010/wordprocessingCanvas" xmlns:cx="http://schemas.microsoft.com/office/drawing/2014/chartex" xmlns:cx1="http://schemas.microsoft.com/office/drawing/2015/9/8/chartex" xmlns:cx2="http://schemas.microsoft.com/office/drawing/2015/10/21/chartex" xmlns:cx3="http://schemas.microsoft.com/office/drawing/2016/5/9/chartex" xmlns:cx4="http://schemas.microsoft.com/office/drawing/2016/5/10/chartex" xmlns:cx5="http://schemas.microsoft.com/office/drawing/2016/5/11/chartex" xmlns:cx6="http://schemas.microsoft.com/office/drawing/2016/5/12/chartex" xmlns:cx7="http://schemas.microsoft.com/office/drawing/2016/5/13/chartex" xmlns:cx8="http://schemas.microsoft.com/office/drawing/2016/5/14/chartex" xmlns:mc="http://schemas.openxmlformats.org/markup-compatibility/2006" xmlns:aink="http://schemas.microsoft.com/office/drawing/2016/ink" xmlns:am3d="http://schemas.microsoft.com/office/drawing/2017/model3d" xmlns:o="urn:schemas-microsoft-com:office:office" xmlns:oel="http://schemas.microsoft.com/office/2019/extlst" xmlns:r="http://schemas.openxmlformats.org/officeDocument/2006/relationships" xmlns:m="http://schemas.openxmlformats.org/officeDocument/2006/math" xmlns:v="urn:schemas-microsoft-com:vml" xmlns:wp14="http://schemas.microsoft.com/office/word/2010/wordprocessingDrawing" xmlns:wp="http://schemas.openxmlformats.org/drawingml/2006/wordprocessingDrawing" xmlns:w10="urn:schemas-microsoft-com:office:word" xmlns:w="http://schemas.openxmlformats.org/wordprocessingml/2006/main" xmlns:w14="http://schemas.microsoft.com/office/word/2010/wordml" xmlns:w15="http://schemas.microsoft.com/office/word/2012/wordml" xmlns:w16cex="http://schemas.microsoft.com/office/word/2018/wordml/cex" xmlns:w16cid="http://schemas.microsoft.com/office/word/2016/wordml/cid" xmlns:w16="http://schemas.microsoft.com/office/word/2018/wordml" xmlns:w16du="http://schemas.microsoft.com/office/word/2023/wordml/word16du" xmlns:w16sdtdh="http://schemas.microsoft.com/office/word/2020/wordml/sdtdatahash" xmlns:w16sdtfl="http://schemas.microsoft.com/office/word/2024/wordml/sdtformatlock" xmlns:w16se="http://schemas.microsoft.com/office/word/2015/wordml/symex" xmlns:wpg="http://schemas.microsoft.com/office/word/2010/wordprocessingGroup" xmlns:wpi="http://schemas.microsoft.com/office/word/2010/wordprocessingInk" xmlns:wne="http://schemas.microsoft.com/office/word/2006/wordml" xmlns:wps="http://schemas.microsoft.com/office/word/2010/wordprocessingShape" mc:Ignorable="w14 w15 w16se w16cid w16 w16cex w16sdtdh w16sdtfl w16du wp14">
   <w:body>
-    <w:p/>
+    <w:p>
+      <w:bookmarkStart w:id="0" w:name="_Hlk212917006"/>
+      <w:bookmarkEnd w:id="0"/>
+    </w:p>
     <w:p/>
     <w:p>
       <w:pPr>
@@ -210,7 +213,7 @@
       <w:pPr>
         <w:pStyle w:val="Heading1"/>
       </w:pPr>
-      <w:bookmarkStart w:id="0" w:name="_Hlk211794100"/>
+      <w:bookmarkStart w:id="1" w:name="_Hlk211794100"/>
       <w:r>
         <w:lastRenderedPageBreak/>
         <w:t xml:space="preserve">Parte 1: </w:t>
@@ -390,7 +393,7 @@
         </w:rPr>
         <w:t xml:space="preserve">(Figura </w:t>
       </w:r>
-      <w:commentRangeStart w:id="1"/>
+      <w:commentRangeStart w:id="2"/>
       <w:r>
         <w:rPr>
           <w:rFonts w:eastAsia="Times New Roman"/>
@@ -400,7 +403,7 @@
         </w:rPr>
         <w:t>1</w:t>
       </w:r>
-      <w:commentRangeEnd w:id="1"/>
+      <w:commentRangeEnd w:id="2"/>
       <w:r>
         <w:rPr>
           <w:rStyle w:val="CommentReference"/>
@@ -410,7 +413,7 @@
           <w:sz w:val="24"/>
           <w:szCs w:val="24"/>
         </w:rPr>
-        <w:commentReference w:id="1"/>
+        <w:commentReference w:id="2"/>
       </w:r>
       <w:r>
         <w:rPr>
@@ -436,10 +439,10 @@
           <w:noProof/>
         </w:rPr>
         <w:drawing>
-          <wp:inline distT="0" distB="0" distL="0" distR="0" wp14:anchorId="11631EE7" wp14:editId="27BA3AD5">
-            <wp:extent cx="5612130" cy="2806065"/>
-            <wp:effectExtent l="0" t="0" r="0" b="0"/>
-            <wp:docPr id="894748873" name="Imagen 1" descr="Gráfico&#10;&#10;El contenido generado por IA puede ser incorrecto."/>
+          <wp:inline distT="0" distB="0" distL="0" distR="0" wp14:anchorId="11631EE7" wp14:editId="4A2D8122">
+            <wp:extent cx="5429250" cy="3523657"/>
+            <wp:effectExtent l="0" t="0" r="0" b="635"/>
+            <wp:docPr id="894748873" name="Imagen 1"/>
             <wp:cNvGraphicFramePr>
               <a:graphicFrameLocks xmlns:a="http://schemas.openxmlformats.org/drawingml/2006/main" noChangeAspect="1"/>
             </wp:cNvGraphicFramePr>
@@ -447,20 +450,19 @@
               <a:graphicData uri="http://schemas.openxmlformats.org/drawingml/2006/picture">
                 <pic:pic xmlns:pic="http://schemas.openxmlformats.org/drawingml/2006/picture">
                   <pic:nvPicPr>
-                    <pic:cNvPr id="894748873" name="Imagen 1" descr="Gráfico&#10;&#10;El contenido generado por IA puede ser incorrecto."/>
+                    <pic:cNvPr id="894748873" name="Imagen 1"/>
                     <pic:cNvPicPr>
                       <a:picLocks noChangeAspect="1" noChangeArrowheads="1"/>
                     </pic:cNvPicPr>
                   </pic:nvPicPr>
                   <pic:blipFill>
-                    <a:blip r:embed="rId15" cstate="print">
+                    <a:blip r:embed="rId15">
                       <a:extLst>
                         <a:ext uri="{28A0092B-C50C-407E-A947-70E740481C1C}">
                           <a14:useLocalDpi xmlns:a14="http://schemas.microsoft.com/office/drawing/2010/main" val="0"/>
                         </a:ext>
                       </a:extLst>
                     </a:blip>
-                    <a:srcRect/>
                     <a:stretch>
                       <a:fillRect/>
                     </a:stretch>
@@ -468,7 +470,7 @@
                   <pic:spPr bwMode="auto">
                     <a:xfrm>
                       <a:off x="0" y="0"/>
-                      <a:ext cx="5612130" cy="2806065"/>
+                      <a:ext cx="5434577" cy="3527114"/>
                     </a:xfrm>
                     <a:prstGeom prst="rect">
                       <a:avLst/>
@@ -549,10 +551,10 @@
         </w:rPr>
         <w:lastRenderedPageBreak/>
         <w:drawing>
-          <wp:inline distT="0" distB="0" distL="0" distR="0" wp14:anchorId="085D3A11" wp14:editId="002E6DEC">
-            <wp:extent cx="5612130" cy="2806065"/>
-            <wp:effectExtent l="0" t="0" r="0" b="0"/>
-            <wp:docPr id="606313985" name="Imagen 2" descr="Gráfico, Gráfico de barras&#10;&#10;El contenido generado por IA puede ser incorrecto."/>
+          <wp:inline distT="0" distB="0" distL="0" distR="0" wp14:anchorId="085D3A11" wp14:editId="433693FF">
+            <wp:extent cx="5839731" cy="3781425"/>
+            <wp:effectExtent l="0" t="0" r="8890" b="0"/>
+            <wp:docPr id="606313985" name="Imagen 2"/>
             <wp:cNvGraphicFramePr>
               <a:graphicFrameLocks xmlns:a="http://schemas.openxmlformats.org/drawingml/2006/main" noChangeAspect="1"/>
             </wp:cNvGraphicFramePr>
@@ -560,20 +562,19 @@
               <a:graphicData uri="http://schemas.openxmlformats.org/drawingml/2006/picture">
                 <pic:pic xmlns:pic="http://schemas.openxmlformats.org/drawingml/2006/picture">
                   <pic:nvPicPr>
-                    <pic:cNvPr id="606313985" name="Imagen 2" descr="Gráfico, Gráfico de barras&#10;&#10;El contenido generado por IA puede ser incorrecto."/>
+                    <pic:cNvPr id="606313985" name="Imagen 2"/>
                     <pic:cNvPicPr>
                       <a:picLocks noChangeAspect="1" noChangeArrowheads="1"/>
                     </pic:cNvPicPr>
                   </pic:nvPicPr>
                   <pic:blipFill>
-                    <a:blip r:embed="rId16" cstate="print">
+                    <a:blip r:embed="rId16">
                       <a:extLst>
                         <a:ext uri="{28A0092B-C50C-407E-A947-70E740481C1C}">
                           <a14:useLocalDpi xmlns:a14="http://schemas.microsoft.com/office/drawing/2010/main" val="0"/>
                         </a:ext>
                       </a:extLst>
                     </a:blip>
-                    <a:srcRect/>
                     <a:stretch>
                       <a:fillRect/>
                     </a:stretch>
@@ -581,7 +582,7 @@
                   <pic:spPr bwMode="auto">
                     <a:xfrm>
                       <a:off x="0" y="0"/>
-                      <a:ext cx="5612130" cy="2806065"/>
+                      <a:ext cx="5854133" cy="3790751"/>
                     </a:xfrm>
                     <a:prstGeom prst="rect">
                       <a:avLst/>
@@ -650,7 +651,11 @@
       </w:r>
       <w:proofErr w:type="spellEnd"/>
       <w:r>
-        <w:t>) antecedente de violencia. Los hallazgos de este análisis permitirán a la Alcaldía de Cartagena diseñar y focalizar políticas públicas más eficientes, asegurando que los recursos se dirijan a los hogares migrantes con mayores niveles de vulnerabilidad que al final representan mayores barreras para su integración a la sociedad.</w:t>
+        <w:t xml:space="preserve">) antecedente de violencia. Los hallazgos de este análisis permitirán a la Alcaldía de Cartagena diseñar y focalizar políticas públicas más eficientes, asegurando que </w:t>
+      </w:r>
+      <w:r>
+        <w:lastRenderedPageBreak/>
+        <w:t>los recursos se dirijan a los hogares migrantes con mayores niveles de vulnerabilidad que al final representan mayores barreras para su integración a la sociedad.</w:t>
       </w:r>
     </w:p>
     <w:p>
@@ -664,7 +669,7 @@
           <w:rFonts w:eastAsiaTheme="minorHAnsi"/>
         </w:rPr>
       </w:pPr>
-      <w:commentRangeStart w:id="2"/>
+      <w:commentRangeStart w:id="3"/>
       <w:r>
         <w:rPr>
           <w:rFonts w:eastAsiaTheme="minorHAnsi"/>
@@ -689,23 +694,19 @@
         </w:rPr>
         <w:t>ficación de su selección</w:t>
       </w:r>
-      <w:commentRangeEnd w:id="2"/>
+      <w:commentRangeEnd w:id="3"/>
       <w:r>
         <w:rPr>
           <w:rStyle w:val="CommentReference"/>
           <w:sz w:val="24"/>
           <w:szCs w:val="24"/>
         </w:rPr>
-        <w:commentReference w:id="2"/>
-      </w:r>
-    </w:p>
-    <w:p>
-      <w:r>
-        <w:t xml:space="preserve">Considerando la pregunta de investigación planteada, en esta sección se definen y describen las variables centrales que orientan el análisis. La variable dependiente corresponde a la </w:t>
-      </w:r>
-      <w:r>
-        <w:lastRenderedPageBreak/>
-        <w:t xml:space="preserve">carencia de acceso a servicios públicos, entendida como un indicador sintético de las condiciones de vivienda. Por su parte, la variable independiente se construye como un índice de vulnerabilidad a nivel de hogar, elaborado a partir de </w:t>
+        <w:commentReference w:id="3"/>
+      </w:r>
+    </w:p>
+    <w:p>
+      <w:r>
+        <w:t xml:space="preserve">Considerando la pregunta de investigación planteada, en esta sección se definen y describen las variables centrales que orientan el análisis. La variable dependiente corresponde a la carencia de acceso a servicios públicos, entendida como un indicador sintético de las condiciones de vivienda. Por su parte, la variable independiente se construye como un índice de vulnerabilidad a nivel de hogar, elaborado a partir de </w:t>
       </w:r>
       <w:r>
         <w:t xml:space="preserve">tres </w:t>
@@ -822,12 +823,15 @@
         <w:t>tabla 1</w:t>
       </w:r>
       <w:r>
-        <w:t>, se evidencia que la variable servicios es de tipo numérico discreto y cuenta con 163 observaciones sin valores faltantes. Representa el número de servicios disponibles en cada hogar, con un rango de 0 a 4, de manera que ningún hogar alcanza el máximo teórico de cinco. Los estadísticos descriptivos muestran un mínimo de 0, un primer cuartil de 0, una mediana de 1, una media de 1.34, un tercer cuartil de 2 y un máximo de 4, lo que evidencia que la distribución está sesgada hacia valores bajos y que la mayoría de los hogares cuentan con pocos servicios.  El sesgo hacia los valores bajos sugiere una heterogeneidad limitada en el acceso, con escasos hogares en situación de privación extrema.</w:t>
-      </w:r>
-    </w:p>
-    <w:p>
+        <w:t xml:space="preserve">, se evidencia que la variable servicios es de tipo numérico discreto y cuenta con 163 observaciones sin valores faltantes. Representa el número de servicios disponibles en </w:t>
+      </w:r>
       <w:r>
         <w:lastRenderedPageBreak/>
+        <w:t>cada hogar, con un rango de 0 a 4, de manera que ningún hogar alcanza el máximo teórico de cinco. Los estadísticos descriptivos muestran un mínimo de 0, un primer cuartil de 0, una mediana de 1, una media de 1.34, un tercer cuartil de 2 y un máximo de 4, lo que evidencia que la distribución está sesgada hacia valores bajos y que la mayoría de los hogares cuentan con pocos servicios.  El sesgo hacia los valores bajos sugiere una heterogeneidad limitada en el acceso, con escasos hogares en situación de privación extrema.</w:t>
+      </w:r>
+    </w:p>
+    <w:p>
+      <w:r>
         <w:t>En términos de vulnerabilidad, este patrón puede interpretarse como una acumulación moderada de desventajas estructurales: la presencia simultánea de múltiples carencias incrementa la exposición de los hogares a condiciones de precariedad. No obstante, se identifica un resultado relevante: algunos hogares presentan mayor número de servicios básicos, pero mantienen niveles altos del índice agregado de vulnerabilidad, lo que sugiere que el acceso a infraestructura no siempre se traduce en menor vulnerabilidad multidimensional, posiblemente debido a limitaciones en ingresos, empleo o capital humano.</w:t>
       </w:r>
     </w:p>
@@ -920,7 +924,6 @@
         <w:t>Estas diferencias entre los resultados ponderados y no ponderados indican que, al ajustar por la estructura poblacional, las carencias tienden a ser más prevalentes, reflejando una mayor proporción de hogares con acceso limitado dentro del universo total de hogares migrantes. En conjunto, los datos evidencian una marcada desigualdad en la cobertura de servicios públicos y una alta concentración de hogares en condiciones de precariedad infraestructural. Este patrón sugiere que el déficit en servicios básicos es uno de los principales componentes estructurales de la vulnerabilidad, aunque, como se analizará más adelante, no siempre existe una correspondencia lineal entre el número de carencias y el nivel general de vulnerabilidad, lo que puede responder a la interacción con otros factores socioeconómicos (como empleo, ingresos o tamaño del hogar).</w:t>
       </w:r>
     </w:p>
-    <w:p/>
     <w:p>
       <w:pPr>
         <w:jc w:val="center"/>
@@ -931,10 +934,10 @@
         </w:rPr>
         <w:lastRenderedPageBreak/>
         <w:drawing>
-          <wp:inline distT="0" distB="0" distL="0" distR="0" wp14:anchorId="5B41130B" wp14:editId="66C09FD3">
-            <wp:extent cx="4399558" cy="2639834"/>
-            <wp:effectExtent l="0" t="0" r="0" b="0"/>
-            <wp:docPr id="2065917477" name="Imagen 5" descr="Imagen que contiene Logotipo&#10;&#10;El contenido generado por IA puede ser incorrecto."/>
+          <wp:inline distT="0" distB="0" distL="0" distR="0" wp14:anchorId="5B41130B" wp14:editId="37D9CE20">
+            <wp:extent cx="5756190" cy="2666365"/>
+            <wp:effectExtent l="0" t="0" r="0" b="635"/>
+            <wp:docPr id="2065917477" name="Imagen 5"/>
             <wp:cNvGraphicFramePr>
               <a:graphicFrameLocks xmlns:a="http://schemas.openxmlformats.org/drawingml/2006/main" noChangeAspect="1"/>
             </wp:cNvGraphicFramePr>
@@ -942,20 +945,20 @@
               <a:graphicData uri="http://schemas.openxmlformats.org/drawingml/2006/picture">
                 <pic:pic xmlns:pic="http://schemas.openxmlformats.org/drawingml/2006/picture">
                   <pic:nvPicPr>
-                    <pic:cNvPr id="2065917477" name="Imagen 5" descr="Imagen que contiene Logotipo&#10;&#10;El contenido generado por IA puede ser incorrecto."/>
+                    <pic:cNvPr id="2065917477" name="Imagen 5"/>
                     <pic:cNvPicPr>
                       <a:picLocks noChangeAspect="1" noChangeArrowheads="1"/>
                     </pic:cNvPicPr>
                   </pic:nvPicPr>
-                  <pic:blipFill>
-                    <a:blip r:embed="rId19" cstate="print">
+                  <pic:blipFill rotWithShape="1">
+                    <a:blip r:embed="rId19">
                       <a:extLst>
                         <a:ext uri="{28A0092B-C50C-407E-A947-70E740481C1C}">
                           <a14:useLocalDpi xmlns:a14="http://schemas.microsoft.com/office/drawing/2010/main" val="0"/>
                         </a:ext>
                       </a:extLst>
                     </a:blip>
-                    <a:srcRect/>
+                    <a:srcRect t="16422"/>
                     <a:stretch>
                       <a:fillRect/>
                     </a:stretch>
@@ -963,7 +966,7 @@
                   <pic:spPr bwMode="auto">
                     <a:xfrm>
                       <a:off x="0" y="0"/>
-                      <a:ext cx="4413159" cy="2647995"/>
+                      <a:ext cx="5760280" cy="2668260"/>
                     </a:xfrm>
                     <a:prstGeom prst="rect">
                       <a:avLst/>
@@ -972,6 +975,11 @@
                     <a:ln>
                       <a:noFill/>
                     </a:ln>
+                    <a:extLst>
+                      <a:ext uri="{53640926-AAD7-44D8-BBD7-CCE9431645EC}">
+                        <a14:shadowObscured xmlns:a14="http://schemas.microsoft.com/office/drawing/2010/main"/>
+                      </a:ext>
+                    </a:extLst>
                   </pic:spPr>
                 </pic:pic>
               </a:graphicData>
@@ -1058,15 +1066,12 @@
       </w:r>
     </w:p>
     <w:p/>
-    <w:p/>
-    <w:p/>
     <w:p>
       <w:r>
         <w:rPr>
           <w:b/>
           <w:bCs/>
         </w:rPr>
-        <w:lastRenderedPageBreak/>
         <w:t>a) Jefatura femenina del hogar:</w:t>
       </w:r>
       <w:r>
@@ -1223,9 +1228,9 @@
         </w:rPr>
         <w:lastRenderedPageBreak/>
         <w:drawing>
-          <wp:inline distT="0" distB="0" distL="0" distR="0" wp14:anchorId="06258C21" wp14:editId="153F70C7">
-            <wp:extent cx="3880237" cy="1979246"/>
-            <wp:effectExtent l="0" t="0" r="0" b="0"/>
+          <wp:inline distT="0" distB="0" distL="0" distR="0" wp14:anchorId="06258C21" wp14:editId="29114BCD">
+            <wp:extent cx="4891158" cy="2705100"/>
+            <wp:effectExtent l="0" t="0" r="5080" b="0"/>
             <wp:docPr id="628174008" name="Imagen 7"/>
             <wp:cNvGraphicFramePr>
               <a:graphicFrameLocks xmlns:a="http://schemas.openxmlformats.org/drawingml/2006/main" noChangeAspect="1"/>
@@ -1234,20 +1239,20 @@
               <a:graphicData uri="http://schemas.openxmlformats.org/drawingml/2006/picture">
                 <pic:pic xmlns:pic="http://schemas.openxmlformats.org/drawingml/2006/picture">
                   <pic:nvPicPr>
-                    <pic:cNvPr id="0" name="Picture 16"/>
+                    <pic:cNvPr id="628174008" name="Imagen 7"/>
                     <pic:cNvPicPr>
                       <a:picLocks noChangeAspect="1" noChangeArrowheads="1"/>
                     </pic:cNvPicPr>
                   </pic:nvPicPr>
                   <pic:blipFill rotWithShape="1">
-                    <a:blip r:embed="rId21" cstate="print">
+                    <a:blip r:embed="rId21">
                       <a:extLst>
                         <a:ext uri="{28A0092B-C50C-407E-A947-70E740481C1C}">
                           <a14:useLocalDpi xmlns:a14="http://schemas.microsoft.com/office/drawing/2010/main" val="0"/>
                         </a:ext>
                       </a:extLst>
                     </a:blip>
-                    <a:srcRect t="14989"/>
+                    <a:srcRect t="16858" b="6598"/>
                     <a:stretch>
                       <a:fillRect/>
                     </a:stretch>
@@ -1255,7 +1260,7 @@
                   <pic:spPr bwMode="auto">
                     <a:xfrm>
                       <a:off x="0" y="0"/>
-                      <a:ext cx="3897010" cy="1987802"/>
+                      <a:ext cx="4892430" cy="2705803"/>
                     </a:xfrm>
                     <a:prstGeom prst="rect">
                       <a:avLst/>
@@ -1338,6 +1343,7 @@
         <w:rPr>
           <w:noProof/>
         </w:rPr>
+        <w:lastRenderedPageBreak/>
         <w:drawing>
           <wp:inline distT="0" distB="0" distL="0" distR="0" wp14:anchorId="70F15739" wp14:editId="65257B50">
             <wp:extent cx="1480782" cy="2182878"/>
@@ -1384,7 +1390,6 @@
           <w:b/>
           <w:bCs/>
         </w:rPr>
-        <w:lastRenderedPageBreak/>
         <w:t xml:space="preserve">Tabla </w:t>
       </w:r>
       <w:r>
@@ -1429,10 +1434,10 @@
           <w:noProof/>
         </w:rPr>
         <w:drawing>
-          <wp:inline distT="0" distB="0" distL="0" distR="0" wp14:anchorId="027FB108" wp14:editId="113A0467">
-            <wp:extent cx="4679985" cy="2399385"/>
-            <wp:effectExtent l="0" t="0" r="0" b="0"/>
-            <wp:docPr id="1260220555" name="Imagen 11" descr="Imagen que contiene Logotipo&#10;&#10;El contenido generado por IA puede ser incorrecto."/>
+          <wp:inline distT="0" distB="0" distL="0" distR="0" wp14:anchorId="027FB108" wp14:editId="6BB28A49">
+            <wp:extent cx="5276279" cy="2705100"/>
+            <wp:effectExtent l="0" t="0" r="635" b="0"/>
+            <wp:docPr id="1260220555" name="Imagen 11"/>
             <wp:cNvGraphicFramePr>
               <a:graphicFrameLocks xmlns:a="http://schemas.openxmlformats.org/drawingml/2006/main" noChangeAspect="1"/>
             </wp:cNvGraphicFramePr>
@@ -1440,20 +1445,20 @@
               <a:graphicData uri="http://schemas.openxmlformats.org/drawingml/2006/picture">
                 <pic:pic xmlns:pic="http://schemas.openxmlformats.org/drawingml/2006/picture">
                   <pic:nvPicPr>
-                    <pic:cNvPr id="1260220555" name="Imagen 11" descr="Imagen que contiene Logotipo&#10;&#10;El contenido generado por IA puede ser incorrecto."/>
+                    <pic:cNvPr id="1260220555" name="Imagen 11"/>
                     <pic:cNvPicPr>
                       <a:picLocks noChangeAspect="1" noChangeArrowheads="1"/>
                     </pic:cNvPicPr>
                   </pic:nvPicPr>
                   <pic:blipFill rotWithShape="1">
-                    <a:blip r:embed="rId23" cstate="print">
+                    <a:blip r:embed="rId23">
                       <a:extLst>
                         <a:ext uri="{28A0092B-C50C-407E-A947-70E740481C1C}">
                           <a14:useLocalDpi xmlns:a14="http://schemas.microsoft.com/office/drawing/2010/main" val="0"/>
                         </a:ext>
                       </a:extLst>
                     </a:blip>
-                    <a:srcRect t="14555"/>
+                    <a:srcRect t="17178" b="3826"/>
                     <a:stretch>
                       <a:fillRect/>
                     </a:stretch>
@@ -1461,7 +1466,7 @@
                   <pic:spPr bwMode="auto">
                     <a:xfrm>
                       <a:off x="0" y="0"/>
-                      <a:ext cx="4689319" cy="2404171"/>
+                      <a:ext cx="5276279" cy="2705100"/>
                     </a:xfrm>
                     <a:prstGeom prst="rect">
                       <a:avLst/>
@@ -1500,7 +1505,11 @@
     </w:p>
     <w:p>
       <w:r>
-        <w:t>En un primer análisis sin ponderar, se observa que el 30.7% de los hogares corresponde a estructuras monoparentales, es decir, aquellos en los que un solo adulto asume la responsabilidad del hogar y del cuidado de los hijos, mientras que el 69.3% restante cuenta con dos o más adultos a cargo. Sin embargo, al incorporar el factor de expansión, que ajusta los datos para reflejar la estructura real de la población, la proporción de hogares monoparentales disminuye a 24.1%, en tanto que los hogares con dos o más adultos aumentan a 75.9%.</w:t>
+        <w:t xml:space="preserve">En un primer análisis sin ponderar, se observa que el 30.7% de los hogares corresponde a estructuras monoparentales, es decir, aquellos en los que un solo adulto asume la responsabilidad del hogar y del cuidado de los hijos, mientras que el 69.3% restante cuenta con dos o más adultos a cargo. Sin embargo, al incorporar el factor de expansión, que ajusta los datos para reflejar la estructura real de la población, la proporción de hogares </w:t>
+      </w:r>
+      <w:r>
+        <w:lastRenderedPageBreak/>
+        <w:t>monoparentales disminuye a 24.1%, en tanto que los hogares con dos o más adultos aumentan a 75.9%.</w:t>
       </w:r>
     </w:p>
     <w:p>
@@ -1526,7 +1535,6 @@
           <w:b/>
           <w:bCs/>
         </w:rPr>
-        <w:lastRenderedPageBreak/>
         <w:t>c) Presencia de personas con discapacidad:</w:t>
       </w:r>
       <w:r>
@@ -1646,11 +1654,12 @@
         <w:rPr>
           <w:noProof/>
         </w:rPr>
+        <w:lastRenderedPageBreak/>
         <w:drawing>
-          <wp:inline distT="0" distB="0" distL="0" distR="0" wp14:anchorId="0CBB0D59" wp14:editId="6AE9A435">
-            <wp:extent cx="4659782" cy="2376879"/>
+          <wp:inline distT="0" distB="0" distL="0" distR="0" wp14:anchorId="0CBB0D59" wp14:editId="6783D14C">
+            <wp:extent cx="5247227" cy="2676525"/>
             <wp:effectExtent l="0" t="0" r="0" b="0"/>
-            <wp:docPr id="1579910872" name="Imagen 13" descr="Imagen que contiene Gráfico&#10;&#10;El contenido generado por IA puede ser incorrecto."/>
+            <wp:docPr id="1579910872" name="Imagen 13"/>
             <wp:cNvGraphicFramePr>
               <a:graphicFrameLocks xmlns:a="http://schemas.openxmlformats.org/drawingml/2006/main" noChangeAspect="1"/>
             </wp:cNvGraphicFramePr>
@@ -1658,20 +1667,20 @@
               <a:graphicData uri="http://schemas.openxmlformats.org/drawingml/2006/picture">
                 <pic:pic xmlns:pic="http://schemas.openxmlformats.org/drawingml/2006/picture">
                   <pic:nvPicPr>
-                    <pic:cNvPr id="1579910872" name="Imagen 13" descr="Imagen que contiene Gráfico&#10;&#10;El contenido generado por IA puede ser incorrecto."/>
+                    <pic:cNvPr id="1579910872" name="Imagen 13"/>
                     <pic:cNvPicPr>
                       <a:picLocks noChangeAspect="1" noChangeArrowheads="1"/>
                     </pic:cNvPicPr>
                   </pic:nvPicPr>
                   <pic:blipFill rotWithShape="1">
-                    <a:blip r:embed="rId25" cstate="print">
+                    <a:blip r:embed="rId25">
                       <a:extLst>
                         <a:ext uri="{28A0092B-C50C-407E-A947-70E740481C1C}">
                           <a14:useLocalDpi xmlns:a14="http://schemas.microsoft.com/office/drawing/2010/main" val="0"/>
                         </a:ext>
                       </a:extLst>
                     </a:blip>
-                    <a:srcRect t="14989"/>
+                    <a:srcRect l="408" t="16319" r="-408" b="4979"/>
                     <a:stretch>
                       <a:fillRect/>
                     </a:stretch>
@@ -1679,7 +1688,7 @@
                   <pic:spPr bwMode="auto">
                     <a:xfrm>
                       <a:off x="0" y="0"/>
-                      <a:ext cx="4666148" cy="2380126"/>
+                      <a:ext cx="5252468" cy="2679198"/>
                     </a:xfrm>
                     <a:prstGeom prst="rect">
                       <a:avLst/>
@@ -1718,7 +1727,6 @@
     </w:p>
     <w:p>
       <w:r>
-        <w:lastRenderedPageBreak/>
         <w:t xml:space="preserve">En la </w:t>
       </w:r>
       <w:r>
@@ -1735,8 +1743,8 @@
       <w:r>
         <w:t xml:space="preserve">La escasa variabilidad de esta variable (concentrada casi por completo en una sola categoría) limita su utilidad analítica, ya que no permite distinguir diferencias significativas entre hogares. En </w:t>
       </w:r>
-      <w:commentRangeStart w:id="3"/>
       <w:commentRangeStart w:id="4"/>
+      <w:commentRangeStart w:id="5"/>
       <w:r>
         <w:t>términos metodológicos, su inclusión dentro del índice de vulnerabilidad podría introducir ruido estadístico o distorsiones en la medició</w:t>
       </w:r>
@@ -1746,32 +1754,37 @@
       <w:r>
         <w:t>, al otorgar peso a una dimensión que no aporta información diferenciadora en el contexto de la muestra</w:t>
       </w:r>
-      <w:commentRangeEnd w:id="3"/>
+      <w:commentRangeEnd w:id="4"/>
       <w:r>
         <w:rPr>
           <w:rStyle w:val="CommentReference"/>
           <w:sz w:val="24"/>
           <w:szCs w:val="24"/>
         </w:rPr>
-        <w:commentReference w:id="3"/>
-      </w:r>
-      <w:commentRangeEnd w:id="4"/>
+        <w:commentReference w:id="4"/>
+      </w:r>
+      <w:commentRangeEnd w:id="5"/>
       <w:r>
         <w:rPr>
           <w:rStyle w:val="CommentReference"/>
         </w:rPr>
-        <w:commentReference w:id="4"/>
+        <w:commentReference w:id="5"/>
       </w:r>
       <w:r>
         <w:t>, por esa razón se elimina del índice.</w:t>
       </w:r>
     </w:p>
+    <w:p/>
+    <w:p/>
+    <w:p/>
+    <w:p/>
     <w:p>
       <w:r>
         <w:rPr>
           <w:b/>
           <w:bCs/>
         </w:rPr>
+        <w:lastRenderedPageBreak/>
         <w:t>d) Antecedentes de violencia o amenazas:</w:t>
       </w:r>
       <w:r>
@@ -1889,11 +1902,7 @@
         <w:t xml:space="preserve">de </w:t>
       </w:r>
       <w:r>
-        <w:t xml:space="preserve">violencia es una variable de tipo dicotómico, codificada como entero con valores 0 y 1. Su propósito es registrar de manera agregada si en el hogar hay al menos una persona que ha sido víctima de violencia o amenazas. El valor 1 identifica la presencia de al </w:t>
-      </w:r>
-      <w:r>
-        <w:lastRenderedPageBreak/>
-        <w:t xml:space="preserve">menos un sobreviviente de violencia o amenazas en el hogar, mientras que el valor 0 indica la ausencia de este antecedente. En una muestra de 163 hogares, la media de esta variable se ubicó en 0.0736, lo que se traduce en una </w:t>
+        <w:t xml:space="preserve">violencia es una variable de tipo dicotómico, codificada como entero con valores 0 y 1. Su propósito es registrar de manera agregada si en el hogar hay al menos una persona que ha sido víctima de violencia o amenazas. El valor 1 identifica la presencia de al menos un sobreviviente de violencia o amenazas en el hogar, mientras que el valor 0 indica la ausencia de este antecedente. En una muestra de 163 hogares, la media de esta variable se ubicó en 0.0736, lo que se traduce en una </w:t>
       </w:r>
       <w:r>
         <w:rPr>
@@ -1911,11 +1920,12 @@
         <w:rPr>
           <w:noProof/>
         </w:rPr>
+        <w:lastRenderedPageBreak/>
         <w:drawing>
-          <wp:inline distT="0" distB="0" distL="0" distR="0" wp14:anchorId="7C5A6AC5" wp14:editId="57EE4569">
+          <wp:inline distT="0" distB="0" distL="0" distR="0" wp14:anchorId="7C5A6AC5" wp14:editId="20A8BD57">
             <wp:extent cx="5612130" cy="2855341"/>
-            <wp:effectExtent l="0" t="0" r="0" b="0"/>
-            <wp:docPr id="353585957" name="Imagen 15" descr="Imagen que contiene Interfaz de usuario gráfica&#10;&#10;El contenido generado por IA puede ser incorrecto."/>
+            <wp:effectExtent l="0" t="0" r="7620" b="2540"/>
+            <wp:docPr id="353585957" name="Imagen 15"/>
             <wp:cNvGraphicFramePr>
               <a:graphicFrameLocks xmlns:a="http://schemas.openxmlformats.org/drawingml/2006/main" noChangeAspect="1"/>
             </wp:cNvGraphicFramePr>
@@ -1923,20 +1933,20 @@
               <a:graphicData uri="http://schemas.openxmlformats.org/drawingml/2006/picture">
                 <pic:pic xmlns:pic="http://schemas.openxmlformats.org/drawingml/2006/picture">
                   <pic:nvPicPr>
-                    <pic:cNvPr id="353585957" name="Imagen 15" descr="Imagen que contiene Interfaz de usuario gráfica&#10;&#10;El contenido generado por IA puede ser incorrecto."/>
+                    <pic:cNvPr id="353585957" name="Imagen 15"/>
                     <pic:cNvPicPr>
                       <a:picLocks noChangeAspect="1" noChangeArrowheads="1"/>
                     </pic:cNvPicPr>
                   </pic:nvPicPr>
                   <pic:blipFill rotWithShape="1">
-                    <a:blip r:embed="rId27" cstate="print">
+                    <a:blip r:embed="rId27">
                       <a:extLst>
                         <a:ext uri="{28A0092B-C50C-407E-A947-70E740481C1C}">
                           <a14:useLocalDpi xmlns:a14="http://schemas.microsoft.com/office/drawing/2010/main" val="0"/>
                         </a:ext>
                       </a:extLst>
                     </a:blip>
-                    <a:srcRect t="15207"/>
+                    <a:srcRect l="509" t="15202" r="-509" b="6296"/>
                     <a:stretch>
                       <a:fillRect/>
                     </a:stretch>
@@ -2030,7 +2040,6 @@
         <w:rPr>
           <w:noProof/>
         </w:rPr>
-        <w:lastRenderedPageBreak/>
         <w:drawing>
           <wp:inline distT="0" distB="0" distL="0" distR="0" wp14:anchorId="4D881A6E" wp14:editId="0A74271E">
             <wp:extent cx="1536192" cy="2349469"/>
@@ -2074,6 +2083,7 @@
           <w:b/>
           <w:bCs/>
         </w:rPr>
+        <w:lastRenderedPageBreak/>
         <w:t xml:space="preserve">Tabla </w:t>
       </w:r>
       <w:r>
@@ -2191,24 +2201,27 @@
     </w:p>
     <w:p>
       <w:r>
-        <w:t xml:space="preserve">La distribución del índice de vulnerabilidad muestra que, al aplicar ponderaciones, se incrementa de manera significativa la proporción de hogares clasificados como no vulnerables (categoría 0), pasando de 24,5% sin ponderar a 40,3% ponderado. En contraste, la categoría 1, que concentra la mayor proporción de hogares en la estimación simple (44,8%), se reduce a 36,4% con ponderaciones de la variable de expansión. De igual forma, la proporción de hogares con vulnerabilidad media (categoría 2) disminuye de 27,6% a </w:t>
-      </w:r>
+        <w:t xml:space="preserve">La distribución del índice de vulnerabilidad muestra que, al aplicar ponderaciones, se incrementa de manera significativa la proporción de hogares clasificados como no vulnerables (categoría 0), pasando de 24,5% sin ponderar a 40,3% ponderado. En contraste, la categoría 1, que concentra la mayor proporción de hogares en la estimación simple (44,8%), se reduce a 36,4% con ponderaciones de la variable de expansión. De igual forma, la proporción de hogares con vulnerabilidad media (categoría 2) disminuye de 27,6% a 20,9%, mientras que los altamente vulnerables (categoría 3) mantienen una presencia baja en la muestra, oscilando entre 3,1% y 2,4%. Estos resultados evidencian que, al considerar los factores de expansión, el peso poblacional de los hogares no vulnerables es mayor al que sugiere la muestra sin ponderar, lo que implica una menor incidencia relativa de la vulnerabilidad en la población total. </w:t>
+      </w:r>
+    </w:p>
+    <w:p>
+      <w:r>
+        <w:t xml:space="preserve">Al examinar en detalle el índice de vulnerabilidad (Figura 8), se observa que corresponde a una variable categórica con valores que van de 0 a </w:t>
+      </w:r>
+      <w:r>
+        <w:t>3</w:t>
+      </w:r>
+      <w:r>
+        <w:t xml:space="preserve">, donde cada número refleja la cantidad de condiciones de vulnerabilidad presentes en el hogar. Se trata de una variable entera que no presenta valores faltantes, lo que asegura la integridad de la información para el análisis. En términos generales, la distribución ponderada muestra que el 40,3 % de los hogares no registra ninguna vulnerabilidad, mientras que el 36,4 % presenta al menos una. Por su parte, el 20,9 % acumula dos condiciones de vulnerabilidad y un 2,4 % alcanza tres. </w:t>
+      </w:r>
+    </w:p>
+    <w:p>
       <w:r>
         <w:lastRenderedPageBreak/>
-        <w:t xml:space="preserve">20,9%, mientras que los altamente vulnerables (categoría 3) mantienen una presencia baja en la muestra, oscilando entre 3,1% y 2,4%. Estos resultados evidencian que, al considerar los factores de expansión, el peso poblacional de los hogares no vulnerables es mayor al que sugiere la muestra sin ponderar, lo que implica una menor incidencia relativa de la vulnerabilidad en la población total. </w:t>
-      </w:r>
-    </w:p>
-    <w:p>
-      <w:r>
-        <w:t xml:space="preserve">Al examinar en detalle el índice de vulnerabilidad (Figura 8), se observa que corresponde a una variable categórica con valores que van de 0 a </w:t>
-      </w:r>
-      <w:r>
-        <w:t>3</w:t>
-      </w:r>
-      <w:r>
-        <w:t>, donde cada número refleja la cantidad de condiciones de vulnerabilidad presentes en el hogar. Se trata de una variable entera que no presenta valores faltantes, lo que asegura la integridad de la información para el análisis. En términos generales, la distribución ponderada muestra que el 40,3 % de los hogares no registra ninguna vulnerabilidad, mientras que el 36,4 % presenta al menos una. Por su parte, el 20,9 % acumula dos condiciones de vulnerabilidad y un 2,4 % alcanza tres. Aunque los hogares con niveles más altos de vulnerabilidad representan un porcentaje reducido, su identificación resulta clave, ya que son los más propensos a enfrentar mayores limitaciones en el acceso a servicios básicos y a requerir intervenciones más focalizadas.</w:t>
-      </w:r>
-    </w:p>
+        <w:t>Aunque los hogares con niveles más altos de vulnerabilidad representan un porcentaje reducido, su identificación resulta clave, ya que son los más propensos a enfrentar mayores limitaciones en el acceso a servicios básicos y a requerir intervenciones más focalizadas.</w:t>
+      </w:r>
+    </w:p>
+    <w:p/>
     <w:p>
       <w:pPr>
         <w:jc w:val="center"/>
@@ -2218,10 +2231,10 @@
           <w:noProof/>
         </w:rPr>
         <w:drawing>
-          <wp:inline distT="0" distB="0" distL="0" distR="0" wp14:anchorId="0D1D31A2" wp14:editId="0C88E3D6">
-            <wp:extent cx="4374108" cy="2363955"/>
-            <wp:effectExtent l="0" t="0" r="7620" b="0"/>
-            <wp:docPr id="1028231611" name="Imagen 20" descr="Gráfico&#10;&#10;El contenido generado por IA puede ser incorrecto."/>
+          <wp:inline distT="0" distB="0" distL="0" distR="0" wp14:anchorId="0D1D31A2" wp14:editId="4E6B35FB">
+            <wp:extent cx="5838825" cy="3381036"/>
+            <wp:effectExtent l="0" t="0" r="0" b="0"/>
+            <wp:docPr id="1028231611" name="Imagen 20"/>
             <wp:cNvGraphicFramePr>
               <a:graphicFrameLocks xmlns:a="http://schemas.openxmlformats.org/drawingml/2006/main" noChangeAspect="1"/>
             </wp:cNvGraphicFramePr>
@@ -2229,20 +2242,20 @@
               <a:graphicData uri="http://schemas.openxmlformats.org/drawingml/2006/picture">
                 <pic:pic xmlns:pic="http://schemas.openxmlformats.org/drawingml/2006/picture">
                   <pic:nvPicPr>
-                    <pic:cNvPr id="1028231611" name="Imagen 20" descr="Gráfico&#10;&#10;El contenido generado por IA puede ser incorrecto."/>
+                    <pic:cNvPr id="1028231611" name="Imagen 20"/>
                     <pic:cNvPicPr>
                       <a:picLocks noChangeAspect="1" noChangeArrowheads="1"/>
                     </pic:cNvPicPr>
                   </pic:nvPicPr>
                   <pic:blipFill rotWithShape="1">
-                    <a:blip r:embed="rId30" cstate="print">
+                    <a:blip r:embed="rId30">
                       <a:extLst>
                         <a:ext uri="{28A0092B-C50C-407E-A947-70E740481C1C}">
                           <a14:useLocalDpi xmlns:a14="http://schemas.microsoft.com/office/drawing/2010/main" val="0"/>
                         </a:ext>
                       </a:extLst>
                     </a:blip>
-                    <a:srcRect t="9929"/>
+                    <a:srcRect t="9743" b="928"/>
                     <a:stretch>
                       <a:fillRect/>
                     </a:stretch>
@@ -2250,7 +2263,7 @@
                   <pic:spPr bwMode="auto">
                     <a:xfrm>
                       <a:off x="0" y="0"/>
-                      <a:ext cx="4380932" cy="2367643"/>
+                      <a:ext cx="5848324" cy="3386536"/>
                     </a:xfrm>
                     <a:prstGeom prst="rect">
                       <a:avLst/>
@@ -2309,8 +2322,11 @@
     </w:p>
     <w:p>
       <w:r>
+        <w:t xml:space="preserve">El análisis gráfico revela que la distribución de carencias en servicios públicos varía de manera sustancial entre los distintos grupos de hogares vulnerables, lo que permite identificar perfiles de mayor riesgo. Por ejemplo, entre los hogares sin vulnerabilidad, el 36,8 % no reporta carencias y apenas un 11,2 % acumula cuatro, mientras que en aquellos con jefatura </w:t>
+      </w:r>
+      <w:r>
         <w:lastRenderedPageBreak/>
-        <w:t xml:space="preserve">El análisis gráfico revela que la distribución de carencias en servicios públicos varía de manera sustancial entre los distintos grupos de hogares vulnerables, lo que permite identificar perfiles de mayor riesgo. Por ejemplo, entre los hogares sin vulnerabilidad, el 36,8 % no reporta carencias y apenas un 11,2 % acumula cuatro, mientras que en aquellos con jefatura femenina o en condición monoparental la proporción de hogares sin carencias disminuye de manera importante, observándose una mayor concentración en niveles intermedios de privación. Esto sugiere que las características estructurales de los hogares inciden en la probabilidad de enfrentar limitaciones en el acceso a servicios básicos, aunque la intensidad de las carencias no sea homogénea entre todos los hogares vulnerables. </w:t>
+        <w:t xml:space="preserve">femenina o en condición monoparental la proporción de hogares sin carencias disminuye de manera importante, observándose una mayor concentración en niveles intermedios de privación. Esto sugiere que las características estructurales de los hogares inciden en la probabilidad de enfrentar limitaciones en el acceso a servicios básicos, aunque la intensidad de las carencias no sea homogénea entre todos los hogares vulnerables. </w:t>
       </w:r>
     </w:p>
     <w:p>
@@ -2327,9 +2343,9 @@
           <w:noProof/>
         </w:rPr>
         <w:drawing>
-          <wp:inline distT="0" distB="0" distL="0" distR="0" wp14:anchorId="1B2A4470" wp14:editId="6A5FBA6B">
-            <wp:extent cx="4008474" cy="2806113"/>
-            <wp:effectExtent l="0" t="0" r="0" b="0"/>
+          <wp:inline distT="0" distB="0" distL="0" distR="0" wp14:anchorId="1B2A4470" wp14:editId="594001CD">
+            <wp:extent cx="4911862" cy="3438525"/>
+            <wp:effectExtent l="0" t="0" r="3175" b="0"/>
             <wp:docPr id="1328965255" name="Imagen 2" descr="Gráfico&#10;&#10;El contenido generado por IA puede ser incorrecto."/>
             <wp:cNvGraphicFramePr>
               <a:graphicFrameLocks xmlns:a="http://schemas.openxmlformats.org/drawingml/2006/main" noChangeAspect="1"/>
@@ -2359,7 +2375,7 @@
                   <pic:spPr bwMode="auto">
                     <a:xfrm>
                       <a:off x="0" y="0"/>
-                      <a:ext cx="4015998" cy="2811380"/>
+                      <a:ext cx="4926585" cy="3448832"/>
                     </a:xfrm>
                     <a:prstGeom prst="rect">
                       <a:avLst/>
@@ -2417,6 +2433,7 @@
     </w:p>
     <w:p>
       <w:pPr>
+        <w:ind w:left="-142"/>
         <w:jc w:val="center"/>
       </w:pPr>
       <w:r>
@@ -2425,9 +2442,9 @@
         </w:rPr>
         <w:lastRenderedPageBreak/>
         <w:drawing>
-          <wp:inline distT="0" distB="0" distL="0" distR="0" wp14:anchorId="1059CC70" wp14:editId="0CD4E7A8">
-            <wp:extent cx="5124893" cy="3727406"/>
-            <wp:effectExtent l="0" t="0" r="0" b="6985"/>
+          <wp:inline distT="0" distB="0" distL="0" distR="0" wp14:anchorId="1059CC70" wp14:editId="58CADB2F">
+            <wp:extent cx="5998028" cy="4362450"/>
+            <wp:effectExtent l="0" t="0" r="3175" b="0"/>
             <wp:docPr id="1256032963" name="Imagen 2" descr="Gráfico&#10;&#10;El contenido generado por IA puede ser incorrecto."/>
             <wp:cNvGraphicFramePr>
               <a:graphicFrameLocks xmlns:a="http://schemas.openxmlformats.org/drawingml/2006/main" noChangeAspect="1"/>
@@ -2457,7 +2474,7 @@
                   <pic:spPr bwMode="auto">
                     <a:xfrm>
                       <a:off x="0" y="0"/>
-                      <a:ext cx="5129359" cy="3730655"/>
+                      <a:ext cx="6009804" cy="4371015"/>
                     </a:xfrm>
                     <a:prstGeom prst="rect">
                       <a:avLst/>
@@ -2474,7 +2491,6 @@
         </w:drawing>
       </w:r>
     </w:p>
-    <w:p/>
     <w:p>
       <w:pPr>
         <w:jc w:val="center"/>
@@ -2501,14 +2517,10 @@
     </w:p>
     <w:p>
       <w:pPr>
-        <w:jc w:val="center"/>
-      </w:pPr>
-    </w:p>
-    <w:p>
-      <w:pPr>
         <w:pStyle w:val="Heading1"/>
       </w:pPr>
       <w:r>
+        <w:lastRenderedPageBreak/>
         <w:t>Parte 2: Evidencia empírica y estimación</w:t>
       </w:r>
     </w:p>
@@ -2516,11 +2528,11 @@
       <w:pPr>
         <w:pStyle w:val="Heading2"/>
       </w:pPr>
-      <w:commentRangeStart w:id="5"/>
+      <w:commentRangeStart w:id="6"/>
       <w:r>
         <w:t>Diseño del contraste estadístico</w:t>
       </w:r>
-      <w:commentRangeEnd w:id="5"/>
+      <w:commentRangeEnd w:id="6"/>
       <w:r>
         <w:rPr>
           <w:rStyle w:val="CommentReference"/>
@@ -2528,7 +2540,7 @@
           <w:b w:val="0"/>
           <w:bCs w:val="0"/>
         </w:rPr>
-        <w:commentReference w:id="5"/>
+        <w:commentReference w:id="6"/>
       </w:r>
     </w:p>
     <w:p>
@@ -2587,21 +2599,32 @@
       </w:r>
     </w:p>
     <w:p>
-      <w:r>
-        <w:t xml:space="preserve">La expectativa teórica, basada en el hecho estilizado de que la vulnerabilidad socioeconómica incrementa la probabilidad de sufrir privaciones en términos del acceso a servicios públicos, es que existe una asociación positiva y directa entre ambas variables. Se espera que los individuos u hogares con mayores índices de vulnerabilidad presenten, en promedio, un mayor número de carencias de servicios básicos. Debido a </w:t>
-      </w:r>
-      <w:r>
-        <w:t xml:space="preserve">que la revisión teórica y los hallazgos iniciales de la parte 1 sugieren una dirección clara </w:t>
-      </w:r>
-      <w:proofErr w:type="spellStart"/>
-      <w:r>
+      <w:pPr>
         <w:rPr>
           <w:i/>
           <w:iCs/>
         </w:rPr>
-        <w:t>exante</w:t>
-      </w:r>
-      <w:proofErr w:type="spellEnd"/>
+      </w:pPr>
+      <w:r>
+        <w:t xml:space="preserve">La expectativa teórica, basada en el hecho estilizado de que la vulnerabilidad socioeconómica incrementa la probabilidad de sufrir privaciones en términos del acceso a servicios públicos, es que existe una asociación positiva y directa entre ambas variables. Se espera que los individuos u hogares con mayores índices de vulnerabilidad presenten, en promedio, un mayor número de carencias de servicios básicos. Debido a </w:t>
+      </w:r>
+      <w:r>
+        <w:t xml:space="preserve">que la revisión teórica y los hallazgos iniciales de la parte 1 sugieren una dirección clara </w:t>
+      </w:r>
+      <w:r>
+        <w:rPr>
+          <w:i/>
+          <w:iCs/>
+        </w:rPr>
+        <w:t>ex-</w:t>
+      </w:r>
+      <w:r>
+        <w:rPr>
+          <w:i/>
+          <w:iCs/>
+        </w:rPr>
+        <w:t>ante</w:t>
+      </w:r>
       <w:r>
         <w:t>, se plantea una prueba de hipótesis</w:t>
       </w:r>
@@ -2945,12 +2968,6 @@
     </w:p>
     <w:p>
       <w:pPr>
-        <w:jc w:val="left"/>
-      </w:pPr>
-    </w:p>
-    <w:p/>
-    <w:p>
-      <w:pPr>
         <w:pStyle w:val="ListParagraph"/>
       </w:pPr>
     </w:p>
@@ -2958,12 +2975,11 @@
       <w:pPr>
         <w:pStyle w:val="Heading2"/>
       </w:pPr>
-      <w:commentRangeStart w:id="6"/>
-      <w:r>
-        <w:lastRenderedPageBreak/>
+      <w:commentRangeStart w:id="7"/>
+      <w:r>
         <w:t xml:space="preserve">Revisar los supuestos y ejecutar la prueba </w:t>
       </w:r>
-      <w:commentRangeEnd w:id="6"/>
+      <w:commentRangeEnd w:id="7"/>
       <w:r>
         <w:rPr>
           <w:rStyle w:val="CommentReference"/>
@@ -2971,7 +2987,7 @@
           <w:b w:val="0"/>
           <w:bCs w:val="0"/>
         </w:rPr>
-        <w:commentReference w:id="6"/>
+        <w:commentReference w:id="7"/>
       </w:r>
     </w:p>
     <w:p>
@@ -3041,10 +3057,18 @@
         </w:rPr>
         <w:t xml:space="preserve">es un coeficiente no paramétrico diseñado para medir la fuerza y la dirección de la asociación entre variables. </w:t>
       </w:r>
-      <w:r>
+    </w:p>
+    <w:p>
+      <w:pPr>
         <w:rPr>
           <w:rFonts w:eastAsiaTheme="minorEastAsia"/>
         </w:rPr>
+      </w:pPr>
+      <w:r>
+        <w:rPr>
+          <w:rFonts w:eastAsiaTheme="minorEastAsia"/>
+        </w:rPr>
+        <w:lastRenderedPageBreak/>
         <w:t>De esta manera, p</w:t>
       </w:r>
       <w:r>
@@ -3437,7 +3461,6 @@
         <w:rPr>
           <w:noProof/>
         </w:rPr>
-        <w:lastRenderedPageBreak/>
         <w:drawing>
           <wp:inline distT="0" distB="0" distL="0" distR="0" wp14:anchorId="139F34C6" wp14:editId="66BA1A69">
             <wp:extent cx="4126675" cy="1468010"/>
@@ -3483,6 +3506,7 @@
         <w:rPr>
           <w:noProof/>
         </w:rPr>
+        <w:lastRenderedPageBreak/>
         <w:drawing>
           <wp:inline distT="0" distB="0" distL="0" distR="0" wp14:anchorId="0ECEAB9B" wp14:editId="60A1C753">
             <wp:extent cx="4163856" cy="1800000"/>
@@ -3524,14 +3548,12 @@
       <w:r>
         <w:t xml:space="preserve">Finalmente, la evaluación del supuesto de </w:t>
       </w:r>
-      <w:proofErr w:type="spellStart"/>
       <w:r>
         <w:t>m</w:t>
       </w:r>
       <w:r>
         <w:t>onotonicidad</w:t>
       </w:r>
-      <w:proofErr w:type="spellEnd"/>
       <w:r>
         <w:t xml:space="preserve"> se realizó mediante la inspección de la </w:t>
       </w:r>
@@ -3629,20 +3651,33 @@
     </w:p>
     <w:p>
       <w:pPr>
+        <w:pStyle w:val="Heading1"/>
+      </w:pPr>
+      <w:r>
+        <w:t xml:space="preserve">Interpretación y comunicación de los resultados </w:t>
+      </w:r>
+    </w:p>
+    <w:p>
+      <w:pPr>
+        <w:pStyle w:val="Heading2"/>
+      </w:pPr>
+      <w:r>
+        <w:t xml:space="preserve">Interpretación </w:t>
+      </w:r>
+    </w:p>
+    <w:p>
+      <w:pPr>
         <w:jc w:val="center"/>
-        <w:rPr>
-          <w:rFonts w:eastAsiaTheme="minorEastAsia"/>
-        </w:rPr>
       </w:pPr>
       <w:r>
         <w:rPr>
           <w:noProof/>
         </w:rPr>
         <w:drawing>
-          <wp:inline distT="0" distB="0" distL="0" distR="0" wp14:anchorId="179BAFAC" wp14:editId="2850388D">
+          <wp:inline distT="0" distB="0" distL="0" distR="0" wp14:anchorId="31C9C707" wp14:editId="24E52EC3">
             <wp:extent cx="4030436" cy="1800000"/>
             <wp:effectExtent l="0" t="0" r="8255" b="0"/>
-            <wp:docPr id="3" name="Imagen 3"/>
+            <wp:docPr id="3" name="Imagen 3" descr="A screenshot of a graph&#10;&#10;AI-generated content may be incorrect."/>
             <wp:cNvGraphicFramePr>
               <a:graphicFrameLocks xmlns:a="http://schemas.openxmlformats.org/drawingml/2006/main" noChangeAspect="1"/>
             </wp:cNvGraphicFramePr>
@@ -3650,7 +3685,7 @@
               <a:graphicData uri="http://schemas.openxmlformats.org/drawingml/2006/picture">
                 <pic:pic xmlns:pic="http://schemas.openxmlformats.org/drawingml/2006/picture">
                   <pic:nvPicPr>
-                    <pic:cNvPr id="1" name=""/>
+                    <pic:cNvPr id="3" name="Imagen 3" descr="A screenshot of a graph&#10;&#10;AI-generated content may be incorrect."/>
                     <pic:cNvPicPr/>
                   </pic:nvPicPr>
                   <pic:blipFill>
@@ -3715,29 +3750,7 @@
         <w:t xml:space="preserve">. El signo </w:t>
       </w:r>
       <w:r>
-        <w:t>negativo indica que la relación monotónica, aunque muy débil, se presenta en la dirección opuesta a la esperada (es decir, una tendencia a que una mayor vulnerabilidad se asocie con un menor número de carencias ponderado).</w:t>
-      </w:r>
-      <w:r>
-        <w:t xml:space="preserve"> </w:t>
-      </w:r>
-      <w:r>
-        <w:t xml:space="preserve">El p-valor </w:t>
-      </w:r>
-      <w:r>
-        <w:t xml:space="preserve">obtenido fue </w:t>
-      </w:r>
-      <w:r>
-        <w:t xml:space="preserve">de 0.91481 </w:t>
-      </w:r>
-      <w:r>
-        <w:lastRenderedPageBreak/>
-        <w:t xml:space="preserve">(obtenido mediante la prueba de permutación) </w:t>
-      </w:r>
-      <w:r>
-        <w:t xml:space="preserve">que </w:t>
-      </w:r>
-      <w:r>
-        <w:t xml:space="preserve">es mayor que el nivel de significancia </w:t>
+        <w:t xml:space="preserve">negativo indica que la relación monotónica, aunque muy débil, se presenta en la dirección opuesta a la esperada (es decir, una tendencia a que una mayor vulnerabilidad se asocie con un menor número de carencias ponderado). El p-valor obtenido fue de 0.91481 (obtenido mediante la prueba de permutación) que es mayor que el nivel de significancia </w:t>
       </w:r>
       <m:oMath>
         <m:r>
@@ -3751,16 +3764,7 @@
         </m:r>
       </m:oMath>
       <w:r>
-        <w:t>;</w:t>
-      </w:r>
-      <w:r>
-        <w:t xml:space="preserve"> </w:t>
-      </w:r>
-      <w:r>
-        <w:t>p</w:t>
-      </w:r>
-      <w:r>
-        <w:t>or lo tanto, se falla en rechazar la hipótesis nula (</w:t>
+        <w:t>; por lo tanto, se falla en rechazar la hipótesis nula (</w:t>
       </w:r>
       <m:oMath>
         <m:sSub>
@@ -3805,31 +3809,7 @@
         </m:r>
       </m:oMath>
       <w:r>
-        <w:t>).</w:t>
-      </w:r>
-      <w:r>
-        <w:t xml:space="preserve"> </w:t>
-      </w:r>
-      <w:r>
-        <w:t xml:space="preserve">Adicionalmente, el </w:t>
-      </w:r>
-      <w:r>
-        <w:t>i</w:t>
-      </w:r>
-      <w:r>
-        <w:t xml:space="preserve">ntervalo de </w:t>
-      </w:r>
-      <w:r>
-        <w:t>c</w:t>
-      </w:r>
-      <w:r>
-        <w:t xml:space="preserve">onfianza al 95% </w:t>
-      </w:r>
-      <w:r>
-        <w:t>fue de</w:t>
-      </w:r>
-      <w:r>
-        <w:t xml:space="preserve"> </w:t>
+        <w:t xml:space="preserve">). Adicionalmente, el intervalo de confianza al 95% fue de </w:t>
       </w:r>
       <m:oMath>
         <m:r>
@@ -3843,10 +3823,7 @@
         </m:r>
       </m:oMath>
       <w:r>
-        <w:t xml:space="preserve">. Dado que el límite inferior es negativo y el intervalo contiene valores negativos e incluye el cero </w:t>
-      </w:r>
-      <w:r>
-        <w:t>(</w:t>
+        <w:t>. Dado que el límite inferior es negativo y el intervalo contiene valores negativos e incluye el cero (</w:t>
       </w:r>
       <m:oMath>
         <m:r>
@@ -3868,196 +3845,505 @@
     </w:p>
     <w:p>
       <w:r>
-        <w:t xml:space="preserve">En este escenario, el riesgo de cometer un error tipo I corresponde al nivel de significancia </w:t>
-      </w:r>
-      <w:r>
-        <w:t xml:space="preserve">con un 5% de rechazar la hipótesis nula de ausencia de relación monótona positiva cuando en realidad esta es verdadera. No obstante, dado que el p-valor obtenido es mucho mayor que dicho umbral, la </w:t>
-      </w:r>
-      <w:r>
-        <w:t xml:space="preserve">hipótesis nula no se rechaza y por lo tanto no existe evidencia de la </w:t>
-      </w:r>
-      <w:r>
-        <w:t>relación y</w:t>
-      </w:r>
-      <w:r>
-        <w:t xml:space="preserve"> no se incurre en este error. </w:t>
-      </w:r>
-    </w:p>
-    <w:p>
-      <w:r>
-        <w:t>En conclusión</w:t>
-      </w:r>
-      <w:r>
+        <w:lastRenderedPageBreak/>
+        <w:t xml:space="preserve">En este escenario, el riesgo de cometer un error tipo I corresponde al nivel de significancia con un 5% de rechazar la hipótesis nula de ausencia de relación monótona positiva cuando en realidad esta es verdadera. No obstante, dado que el p-valor obtenido es mucho mayor que dicho umbral, la hipótesis nula no se rechaza y por lo tanto no existe evidencia de la relación y no se incurre en este error. </w:t>
+      </w:r>
+      <w:r>
+        <w:t>En conclusión,</w:t>
+      </w:r>
+      <w:r>
+        <w:t xml:space="preserve"> considerando </w:t>
+      </w:r>
+      <w:r>
+        <w:t xml:space="preserve">el efecto de los factores de expansión poblacional, no existe evidencia estadística </w:t>
+      </w:r>
+      <w:r>
+        <w:t>significativa</w:t>
+      </w:r>
+      <w:r>
+        <w:t xml:space="preserve"> para afirmar que el índice de vulnerabilidad y el número de carencias de servicios present</w:t>
+      </w:r>
+      <w:r>
+        <w:t>an</w:t>
+      </w:r>
+      <w:r>
+        <w:t xml:space="preserve"> una relación monotónica positiva en la población migrante de Cartagena. </w:t>
+      </w:r>
+    </w:p>
+    <w:p>
+      <w:r>
+        <w:t>Ahora bien, desde el punto de vista sustantivo</w:t>
+      </w:r>
+      <w:r>
+        <w:t xml:space="preserve">, los resultados anteriormente descritos </w:t>
+      </w:r>
+      <w:r>
+        <w:t xml:space="preserve">implican que el nivel de vulnerabilidad de la población migrante venezolana en la ciudad de Cartagena no se asocia de forma consistente con el número de carencias en servicios básicos. Esto puede reflejar que la vulnerabilidad, entendida como una condición multidimensional </w:t>
+      </w:r>
+      <w:r>
+        <w:t xml:space="preserve">conformada por factores sociales, económicos y demográficos, no se refleja directamente en </w:t>
+      </w:r>
+      <w:r>
+        <w:t xml:space="preserve">limitaciones materiales o insuficiencia en servicios. </w:t>
+      </w:r>
+      <w:r>
+        <w:t xml:space="preserve">En otras palabras, es posible que existan hogares altamente vulnerables pero que hayan accedido a servicios básicos por diferentes </w:t>
+      </w:r>
+      <w:r>
+        <w:t xml:space="preserve">canales como redes comunitarias o campañas locales, o que, de lo contrario, existan hogares con menor vulnerabilidad percibida, pero con mayores deficiencias en infraestructura para acceso a servicios públicos. </w:t>
+      </w:r>
+    </w:p>
+    <w:p>
+      <w:r>
+        <w:t xml:space="preserve">Lo anterior, en términos de política pública, </w:t>
+      </w:r>
+      <w:r>
+        <w:t xml:space="preserve">considerando la ausencia de correlación significativa </w:t>
+      </w:r>
+      <w:r>
+        <w:t>sugiere que es necesario distinguir posiblemente entre una vulnerabilidad estructural como se definió en el indicador y de carencias materiales al diseñar programas de atención a población migrante. Esta evidencia estadística sugiere que estas dos dimensiones no se comportan de manera paralela, por lo que las intervenciones deberían abordar cada una con un</w:t>
+      </w:r>
+      <w:r>
+        <w:t xml:space="preserve">a solución </w:t>
+      </w:r>
+      <w:r>
+        <w:t>diferenciada.</w:t>
+      </w:r>
+      <w:r>
+        <w:t xml:space="preserve"> </w:t>
+      </w:r>
+    </w:p>
+    <w:p>
+      <w:pPr>
+        <w:pStyle w:val="Heading2"/>
+      </w:pPr>
+      <w:r>
+        <w:t xml:space="preserve">Comunicación </w:t>
+      </w:r>
+    </w:p>
+    <w:p>
+      <w:pPr>
+        <w:jc w:val="left"/>
+        <w:rPr>
+          <w:lang w:eastAsia="en-US"/>
+        </w:rPr>
+      </w:pPr>
+      <w:r>
+        <w:rPr>
+          <w:lang w:eastAsia="en-US"/>
+        </w:rPr>
+        <w:t>Como soporte adicional de los resultados anteriores, se presentan a continuación los gráficos que ilustran visualmente el no rechazo de la hipótesis nula en este análisis.</w:t>
+      </w:r>
+      <w:r>
+        <w:rPr>
+          <w:lang w:eastAsia="en-US"/>
+        </w:rPr>
+        <w:br/>
+        <w:t>En primer lugar, se muestra la masa de probabilidad ponderada, que permite observar cómo se distribuye de manera conjunta la población</w:t>
+      </w:r>
+      <w:r>
+        <w:rPr>
+          <w:lang w:eastAsia="en-US"/>
+        </w:rPr>
+        <w:t xml:space="preserve">, </w:t>
+      </w:r>
+      <w:r>
+        <w:rPr>
+          <w:lang w:eastAsia="en-US"/>
+        </w:rPr>
+        <w:t>ajustada por sus factores de expansión</w:t>
+      </w:r>
+      <w:r>
+        <w:rPr>
+          <w:lang w:eastAsia="en-US"/>
+        </w:rPr>
         <w:t>,</w:t>
       </w:r>
       <w:r>
-        <w:t xml:space="preserve"> considerando </w:t>
-      </w:r>
-      <w:r>
-        <w:t xml:space="preserve">el efecto de los factores de expansión poblacional, no existe evidencia estadística </w:t>
-      </w:r>
-      <w:r>
-        <w:t>significativa</w:t>
-      </w:r>
-      <w:r>
-        <w:t xml:space="preserve"> para afirmar que el índice de vulnerabilidad y el número de carencias de servicios present</w:t>
-      </w:r>
-      <w:r>
-        <w:t>an</w:t>
-      </w:r>
-      <w:r>
-        <w:t xml:space="preserve"> una relación monotónica positiva en la población migrante de Cartagena. </w:t>
-      </w:r>
-    </w:p>
-    <w:p>
-      <w:pPr>
-        <w:pStyle w:val="Heading1"/>
-      </w:pPr>
-      <w:r>
-        <w:t xml:space="preserve">Parte </w:t>
-      </w:r>
-      <w:r>
+        <w:rPr>
+          <w:lang w:eastAsia="en-US"/>
+        </w:rPr>
+        <w:t xml:space="preserve"> en los distintos niveles del índice de vulnerabilidad y del número de carencias.</w:t>
+      </w:r>
+    </w:p>
+    <w:p/>
+    <w:p>
+      <w:pPr>
+        <w:jc w:val="center"/>
+      </w:pPr>
+      <w:r>
+        <w:rPr>
+          <w:noProof/>
+        </w:rPr>
+        <w:lastRenderedPageBreak/>
+        <w:drawing>
+          <wp:inline distT="0" distB="0" distL="0" distR="0" wp14:anchorId="2C4394D6" wp14:editId="5ACBE953">
+            <wp:extent cx="5903427" cy="3629025"/>
+            <wp:effectExtent l="0" t="0" r="2540" b="0"/>
+            <wp:docPr id="283274169" name="Picture 1"/>
+            <wp:cNvGraphicFramePr>
+              <a:graphicFrameLocks xmlns:a="http://schemas.openxmlformats.org/drawingml/2006/main" noChangeAspect="1"/>
+            </wp:cNvGraphicFramePr>
+            <a:graphic xmlns:a="http://schemas.openxmlformats.org/drawingml/2006/main">
+              <a:graphicData uri="http://schemas.openxmlformats.org/drawingml/2006/picture">
+                <pic:pic xmlns:pic="http://schemas.openxmlformats.org/drawingml/2006/picture">
+                  <pic:nvPicPr>
+                    <pic:cNvPr id="283274169" name="Picture 1"/>
+                    <pic:cNvPicPr/>
+                  </pic:nvPicPr>
+                  <pic:blipFill rotWithShape="1">
+                    <a:blip r:embed="rId36">
+                      <a:extLst>
+                        <a:ext uri="{28A0092B-C50C-407E-A947-70E740481C1C}">
+                          <a14:useLocalDpi xmlns:a14="http://schemas.microsoft.com/office/drawing/2010/main" val="0"/>
+                        </a:ext>
+                      </a:extLst>
+                    </a:blip>
+                    <a:srcRect t="7906" b="-2901"/>
+                    <a:stretch>
+                      <a:fillRect/>
+                    </a:stretch>
+                  </pic:blipFill>
+                  <pic:spPr bwMode="auto">
+                    <a:xfrm>
+                      <a:off x="0" y="0"/>
+                      <a:ext cx="5907967" cy="3631816"/>
+                    </a:xfrm>
+                    <a:prstGeom prst="rect">
+                      <a:avLst/>
+                    </a:prstGeom>
+                    <a:ln>
+                      <a:noFill/>
+                    </a:ln>
+                    <a:extLst>
+                      <a:ext uri="{53640926-AAD7-44D8-BBD7-CCE9431645EC}">
+                        <a14:shadowObscured xmlns:a14="http://schemas.microsoft.com/office/drawing/2010/main"/>
+                      </a:ext>
+                    </a:extLst>
+                  </pic:spPr>
+                </pic:pic>
+              </a:graphicData>
+            </a:graphic>
+          </wp:inline>
+        </w:drawing>
+      </w:r>
+    </w:p>
+    <w:p>
+      <w:pPr>
+        <w:jc w:val="center"/>
+      </w:pPr>
+      <w:r>
+        <w:rPr>
+          <w:b/>
+          <w:bCs/>
+        </w:rPr>
+        <w:t>Figura 1</w:t>
+      </w:r>
+      <w:r>
+        <w:rPr>
+          <w:b/>
+          <w:bCs/>
+        </w:rPr>
+        <w:t>1</w:t>
+      </w:r>
+      <w:r>
+        <w:rPr>
+          <w:b/>
+          <w:bCs/>
+        </w:rPr>
+        <w:t>.</w:t>
+      </w:r>
+      <w:r>
+        <w:t xml:space="preserve"> </w:t>
+      </w:r>
+      <w:r>
+        <w:t>Mapa de calor ponderado</w:t>
+      </w:r>
+      <w:r>
+        <w:t>. Fuente: Evaluación Conjunta de Necesidades. Elaboración propia.</w:t>
+      </w:r>
+    </w:p>
+    <w:p>
+      <w:pPr>
+        <w:jc w:val="left"/>
+        <w:rPr>
+          <w:lang w:eastAsia="en-US"/>
+        </w:rPr>
+      </w:pPr>
+      <w:r>
+        <w:rPr>
+          <w:lang w:eastAsia="en-US"/>
+        </w:rPr>
+        <w:t xml:space="preserve">El gráfico evidencia que, al encontrarse la masa distribuida de forma dispersa y sin un patrón diagonal claro, se confirma la ausencia de una correlación estadística y sustantiva, en coherencia con el valor del coeficiente de Spearman y su correspondiente p-valor. En términos prácticos, esta visualización permite diagnosticar si existe o no una tendencia monotónica, es decir, un aumento o disminución </w:t>
+      </w:r>
+      <w:r>
+        <w:rPr>
+          <w:lang w:eastAsia="en-US"/>
+        </w:rPr>
+        <w:t>consistente</w:t>
+      </w:r>
+      <w:r>
+        <w:rPr>
+          <w:lang w:eastAsia="en-US"/>
+        </w:rPr>
+        <w:t xml:space="preserve"> de las carencias a medida que se incrementa la vulnerabilidad, la cual, en este caso, no se manifiesta en los datos analizados.</w:t>
+      </w:r>
+    </w:p>
+    <w:p/>
+    <w:p>
+      <w:pPr>
+        <w:jc w:val="center"/>
+      </w:pPr>
+      <w:r>
+        <w:rPr>
+          <w:noProof/>
+        </w:rPr>
+        <w:lastRenderedPageBreak/>
+        <w:drawing>
+          <wp:inline distT="0" distB="0" distL="0" distR="0" wp14:anchorId="63A10978" wp14:editId="18E65840">
+            <wp:extent cx="5347454" cy="3190875"/>
+            <wp:effectExtent l="0" t="0" r="5715" b="0"/>
+            <wp:docPr id="1124828718" name="Picture 2" descr="A graph with a line and dots&#10;&#10;AI-generated content may be incorrect."/>
+            <wp:cNvGraphicFramePr>
+              <a:graphicFrameLocks xmlns:a="http://schemas.openxmlformats.org/drawingml/2006/main" noChangeAspect="1"/>
+            </wp:cNvGraphicFramePr>
+            <a:graphic xmlns:a="http://schemas.openxmlformats.org/drawingml/2006/main">
+              <a:graphicData uri="http://schemas.openxmlformats.org/drawingml/2006/picture">
+                <pic:pic xmlns:pic="http://schemas.openxmlformats.org/drawingml/2006/picture">
+                  <pic:nvPicPr>
+                    <pic:cNvPr id="1124828718" name="Picture 2" descr="A graph with a line and dots&#10;&#10;AI-generated content may be incorrect."/>
+                    <pic:cNvPicPr/>
+                  </pic:nvPicPr>
+                  <pic:blipFill rotWithShape="1">
+                    <a:blip r:embed="rId37">
+                      <a:extLst>
+                        <a:ext uri="{28A0092B-C50C-407E-A947-70E740481C1C}">
+                          <a14:useLocalDpi xmlns:a14="http://schemas.microsoft.com/office/drawing/2010/main" val="0"/>
+                        </a:ext>
+                      </a:extLst>
+                    </a:blip>
+                    <a:srcRect t="7829"/>
+                    <a:stretch>
+                      <a:fillRect/>
+                    </a:stretch>
+                  </pic:blipFill>
+                  <pic:spPr bwMode="auto">
+                    <a:xfrm>
+                      <a:off x="0" y="0"/>
+                      <a:ext cx="5357132" cy="3196650"/>
+                    </a:xfrm>
+                    <a:prstGeom prst="rect">
+                      <a:avLst/>
+                    </a:prstGeom>
+                    <a:ln>
+                      <a:noFill/>
+                    </a:ln>
+                    <a:extLst>
+                      <a:ext uri="{53640926-AAD7-44D8-BBD7-CCE9431645EC}">
+                        <a14:shadowObscured xmlns:a14="http://schemas.microsoft.com/office/drawing/2010/main"/>
+                      </a:ext>
+                    </a:extLst>
+                  </pic:spPr>
+                </pic:pic>
+              </a:graphicData>
+            </a:graphic>
+          </wp:inline>
+        </w:drawing>
+      </w:r>
+    </w:p>
+    <w:p>
+      <w:pPr>
+        <w:jc w:val="center"/>
+      </w:pPr>
+      <w:r>
+        <w:rPr>
+          <w:b/>
+          <w:bCs/>
+        </w:rPr>
+        <w:t xml:space="preserve">Figura </w:t>
+      </w:r>
+      <w:r>
+        <w:rPr>
+          <w:b/>
+          <w:bCs/>
+        </w:rPr>
+        <w:t>1</w:t>
+      </w:r>
+      <w:r>
+        <w:rPr>
+          <w:b/>
+          <w:bCs/>
+        </w:rPr>
+        <w:t>2</w:t>
+      </w:r>
+      <w:r>
+        <w:rPr>
+          <w:b/>
+          <w:bCs/>
+        </w:rPr>
+        <w:t>.</w:t>
+      </w:r>
+      <w:r>
+        <w:t xml:space="preserve"> </w:t>
+      </w:r>
+      <w:r>
+        <w:t>Tendencia monotónica</w:t>
+      </w:r>
+      <w:r>
+        <w:t xml:space="preserve"> con promedio ponderado</w:t>
+      </w:r>
+      <w:r>
+        <w:t>. Fuente: Evaluación Conjunta de Necesidades. Elaboración propia.</w:t>
+      </w:r>
+    </w:p>
+    <w:p>
+      <w:r>
+        <w:t xml:space="preserve">Por su parte, el gráfico de tendencia monotónica basado en los promedios ponderados muestra la media de carencias correspondiente a cada nivel de vulnerabilidad. </w:t>
+      </w:r>
+      <w:r>
+        <w:t xml:space="preserve">En particular, </w:t>
+      </w:r>
+      <w:r>
+        <w:t>niveles bajos de vulnerabilidad</w:t>
+      </w:r>
+      <w:r>
+        <w:t xml:space="preserve">, </w:t>
+      </w:r>
+      <w:r>
+        <w:t>la media de carencias es similar y relativamente alta, mientras que en el nivel 2 se observa una disminución pronunciada y en el nivel 3 un leve incremento.</w:t>
+      </w:r>
+      <w:r>
+        <w:t xml:space="preserve"> </w:t>
+      </w:r>
+      <w:r>
+        <w:t>En este tipo de representación, una relación monotónica se reflejaría en un patrón ascendente claro y regular, indicando que a mayores niveles de vulnerabilidad corresponden mayores carencias. Sin embargo, el gráfico evidencia una curva dispersa y sin una dirección definida, lo que confirma la ausencia de monotonicidad y respalda la falta de asociación sistemática entre ambas variables.</w:t>
+      </w:r>
+    </w:p>
+    <w:p/>
+    <w:p/>
+    <w:p/>
+    <w:p/>
+    <w:p>
+      <w:r>
+        <w:rPr>
+          <w:noProof/>
+        </w:rPr>
+        <w:lastRenderedPageBreak/>
+        <w:drawing>
+          <wp:inline distT="0" distB="0" distL="0" distR="0" wp14:anchorId="6610E395" wp14:editId="508AB875">
+            <wp:extent cx="5612130" cy="3270250"/>
+            <wp:effectExtent l="0" t="0" r="7620" b="6350"/>
+            <wp:docPr id="1250143682" name="Picture 3" descr="A graph of a diagram&#10;&#10;AI-generated content may be incorrect."/>
+            <wp:cNvGraphicFramePr>
+              <a:graphicFrameLocks xmlns:a="http://schemas.openxmlformats.org/drawingml/2006/main" noChangeAspect="1"/>
+            </wp:cNvGraphicFramePr>
+            <a:graphic xmlns:a="http://schemas.openxmlformats.org/drawingml/2006/main">
+              <a:graphicData uri="http://schemas.openxmlformats.org/drawingml/2006/picture">
+                <pic:pic xmlns:pic="http://schemas.openxmlformats.org/drawingml/2006/picture">
+                  <pic:nvPicPr>
+                    <pic:cNvPr id="1250143682" name="Picture 3" descr="A graph of a diagram&#10;&#10;AI-generated content may be incorrect."/>
+                    <pic:cNvPicPr/>
+                  </pic:nvPicPr>
+                  <pic:blipFill rotWithShape="1">
+                    <a:blip r:embed="rId38">
+                      <a:extLst>
+                        <a:ext uri="{28A0092B-C50C-407E-A947-70E740481C1C}">
+                          <a14:useLocalDpi xmlns:a14="http://schemas.microsoft.com/office/drawing/2010/main" val="0"/>
+                        </a:ext>
+                      </a:extLst>
+                    </a:blip>
+                    <a:srcRect t="10201"/>
+                    <a:stretch>
+                      <a:fillRect/>
+                    </a:stretch>
+                  </pic:blipFill>
+                  <pic:spPr bwMode="auto">
+                    <a:xfrm>
+                      <a:off x="0" y="0"/>
+                      <a:ext cx="5612130" cy="3270250"/>
+                    </a:xfrm>
+                    <a:prstGeom prst="rect">
+                      <a:avLst/>
+                    </a:prstGeom>
+                    <a:ln>
+                      <a:noFill/>
+                    </a:ln>
+                    <a:extLst>
+                      <a:ext uri="{53640926-AAD7-44D8-BBD7-CCE9431645EC}">
+                        <a14:shadowObscured xmlns:a14="http://schemas.microsoft.com/office/drawing/2010/main"/>
+                      </a:ext>
+                    </a:extLst>
+                  </pic:spPr>
+                </pic:pic>
+              </a:graphicData>
+            </a:graphic>
+          </wp:inline>
+        </w:drawing>
+      </w:r>
+    </w:p>
+    <w:p>
+      <w:pPr>
+        <w:jc w:val="center"/>
+      </w:pPr>
+      <w:r>
+        <w:rPr>
+          <w:b/>
+          <w:bCs/>
+        </w:rPr>
+        <w:t xml:space="preserve">Figura </w:t>
+      </w:r>
+      <w:r>
+        <w:rPr>
+          <w:b/>
+          <w:bCs/>
+        </w:rPr>
+        <w:t>1</w:t>
+      </w:r>
+      <w:r>
+        <w:rPr>
+          <w:b/>
+          <w:bCs/>
+        </w:rPr>
         <w:t>3</w:t>
       </w:r>
       <w:r>
-        <w:t xml:space="preserve">: </w:t>
-      </w:r>
-      <w:r>
-        <w:t xml:space="preserve">Interpretación y comunicación de los resultados </w:t>
-      </w:r>
-    </w:p>
-    <w:p>
-      <w:pPr>
-        <w:pStyle w:val="Heading2"/>
-      </w:pPr>
-      <w:r>
-        <w:t xml:space="preserve">Interpretación </w:t>
-      </w:r>
-    </w:p>
-    <w:p>
-      <w:pPr>
-        <w:pStyle w:val="ListParagraph"/>
-        <w:numPr>
-          <w:ilvl w:val="0"/>
-          <w:numId w:val="3"/>
-        </w:numPr>
-      </w:pPr>
-      <w:commentRangeStart w:id="7"/>
-      <w:r>
-        <w:t xml:space="preserve">Verificar si el resultado de la prueba y el intervalo conducen a la misma conclusión </w:t>
-      </w:r>
-    </w:p>
-    <w:p>
-      <w:pPr>
-        <w:pStyle w:val="ListParagraph"/>
-        <w:numPr>
-          <w:ilvl w:val="0"/>
-          <w:numId w:val="3"/>
-        </w:numPr>
-      </w:pPr>
-      <w:r>
-        <w:t xml:space="preserve">Interpretar el resultado en relación con la hipótesis nula y con el contexto del análisis </w:t>
-      </w:r>
-    </w:p>
-    <w:p>
-      <w:pPr>
-        <w:pStyle w:val="ListParagraph"/>
-        <w:numPr>
-          <w:ilvl w:val="0"/>
-          <w:numId w:val="3"/>
-        </w:numPr>
-      </w:pPr>
-      <w:r>
-        <w:t xml:space="preserve">Explicar qué implican los resultados en términos sustantivos: ¿qué nos dicen sobre el fenómeno estudiado? </w:t>
-      </w:r>
-      <w:commentRangeEnd w:id="7"/>
-      <w:r>
-        <w:rPr>
-          <w:rStyle w:val="CommentReference"/>
-          <w:sz w:val="24"/>
-          <w:szCs w:val="24"/>
-        </w:rPr>
-        <w:commentReference w:id="7"/>
-      </w:r>
-    </w:p>
-    <w:p>
-      <w:pPr>
-        <w:pStyle w:val="Heading2"/>
-      </w:pPr>
-      <w:r>
-        <w:t xml:space="preserve">Comunicación </w:t>
-      </w:r>
-    </w:p>
-    <w:p>
-      <w:commentRangeStart w:id="10"/>
-      <w:r>
-        <w:t xml:space="preserve">Acompañe el resultado del contraste con una o más visualizaciones que permitan interpretar la diferencia o relación observada (por ejemplo, barras con intervalos de confianza, densidades comparadas, gráficos de dispersión con tendencia, etc.) </w:t>
-      </w:r>
-      <w:commentRangeEnd w:id="10"/>
-      <w:r>
-        <w:rPr>
-          <w:rStyle w:val="CommentReference"/>
-          <w:sz w:val="24"/>
-          <w:szCs w:val="24"/>
-        </w:rPr>
-        <w:commentReference w:id="10"/>
-      </w:r>
-      <w:r>
-        <w:t>Si ya los ya creados en el EDA son oportunos, compleméntelos e integrarlos a la narrativa que permite realizar la prueba de hipótesis. La narrativa es un breve texto de apoyo que explique lo que muestra el gráfico y cómo respalda (o no) la hipótesis planteada.</w:t>
-      </w:r>
-    </w:p>
-    <w:p>
-      <w:pPr>
-        <w:pStyle w:val="Heading1"/>
-      </w:pPr>
-      <w:r>
-        <w:t xml:space="preserve">Consistencia entre visualizaciones y la respuesta a la pregunta planteada </w:t>
-      </w:r>
-    </w:p>
-    <w:p>
-      <w:pPr>
-        <w:pStyle w:val="Heading1"/>
-      </w:pPr>
-      <w:commentRangeStart w:id="11"/>
-      <w:r>
-        <w:t xml:space="preserve">Precisión y pertenencia de la respuesta planteada de acuerdo con la situación del contexto </w:t>
-      </w:r>
-    </w:p>
-    <w:p>
-      <w:pPr>
-        <w:pStyle w:val="Heading1"/>
-      </w:pPr>
-      <w:r>
-        <w:t>Coherencia narrativa y argumentativa en las conclusiones</w:t>
-      </w:r>
-      <w:commentRangeEnd w:id="11"/>
-      <w:r>
-        <w:rPr>
-          <w:rStyle w:val="CommentReference"/>
-          <w:sz w:val="24"/>
-          <w:szCs w:val="24"/>
-        </w:rPr>
-        <w:commentReference w:id="11"/>
-      </w:r>
-    </w:p>
-    <w:p>
-      <w:pPr>
-        <w:pStyle w:val="Heading1"/>
-      </w:pPr>
-      <w:commentRangeStart w:id="13"/>
-      <w:r>
-        <w:t xml:space="preserve">Añadir una breve descripción de los principales ajustes realizados a partir de la retroalimentación recibida. </w:t>
-      </w:r>
-      <w:commentRangeEnd w:id="13"/>
-      <w:r>
-        <w:rPr>
-          <w:rStyle w:val="CommentReference"/>
-          <w:sz w:val="24"/>
-          <w:szCs w:val="24"/>
-        </w:rPr>
-        <w:commentReference w:id="13"/>
-      </w:r>
-    </w:p>
+        <w:rPr>
+          <w:b/>
+          <w:bCs/>
+        </w:rPr>
+        <w:t>.</w:t>
+      </w:r>
+      <w:r>
+        <w:t xml:space="preserve"> </w:t>
+      </w:r>
+      <w:r>
+        <w:t>Distribución Bootstrap del coeficiente Spearman ponderado</w:t>
+      </w:r>
+      <w:r>
+        <w:t>. Fuente: Evaluación Conjunta de Necesidades. Elaboración propia.</w:t>
+      </w:r>
+    </w:p>
+    <w:p>
+      <w:r>
+        <w:t>Finalmente, el gráfico Bootstrap permite visualizar la incertidumbre asociada al coeficiente de correlación de Spearman estimado. En esta distribución, las líneas punteadas representan los límites del intervalo de confianza al 95 %, dentro del cual se observa que el cero y valores de signo opuesto están contenidos. Esto confirma que la relación observada carece de significancia estadística y que el coeficiente podría variar aleatoriamente alrededor de cero.</w:t>
+      </w:r>
+    </w:p>
+    <w:p>
+      <w:r>
+        <w:t xml:space="preserve"> En </w:t>
+      </w:r>
+      <w:r>
+        <w:t>el sentido práctico</w:t>
+      </w:r>
+      <w:r>
+        <w:t>, la forma simétrica y centrada de la distribución refuerza la conclusión de que no existe una asociación monotónica consistente entre la vulnerabilidad y las carencias, ya que la variabilidad del estimador sugiere que cualquier relación aparente es débil e inestable.</w:t>
+      </w:r>
+    </w:p>
+    <w:p/>
+    <w:p/>
+    <w:p/>
+    <w:p/>
+    <w:p/>
     <w:p>
       <w:r>
         <w:lastRenderedPageBreak/>
@@ -4198,7 +4484,7 @@
         <w:jc w:val="center"/>
       </w:pPr>
     </w:p>
-    <w:bookmarkEnd w:id="0"/>
+    <w:bookmarkEnd w:id="1"/>
     <w:p>
       <w:pPr>
         <w:rPr>
@@ -4338,7 +4624,13 @@
                 <w:t xml:space="preserve"> </w:t>
               </w:r>
               <w:r>
-                <w:t xml:space="preserve">(2023). Colombia, el país más solidario con la migración venezolana. </w:t>
+                <w:rPr>
+                  <w:lang w:val="en-US"/>
+                </w:rPr>
+                <w:t xml:space="preserve">(2023). </w:t>
+              </w:r>
+              <w:r>
+                <w:t xml:space="preserve">Colombia, el país más solidario con la migración venezolana. </w:t>
               </w:r>
             </w:p>
             <w:p>
@@ -4356,7 +4648,7 @@
       </w:sdtContent>
     </w:sdt>
     <w:sectPr>
-      <w:headerReference w:type="default" r:id="rId36"/>
+      <w:headerReference w:type="default" r:id="rId39"/>
       <w:pgSz w:w="12240" w:h="15840"/>
       <w:pgMar w:top="1417" w:right="1701" w:bottom="1417" w:left="1701" w:header="283" w:footer="283" w:gutter="0"/>
       <w:cols w:space="708"/>
@@ -4368,7 +4660,7 @@
 
 <file path=word/comments.xml><?xml version="1.0" encoding="utf-8"?>
 <w:comments xmlns:wpc="http://schemas.microsoft.com/office/word/2010/wordprocessingCanvas" xmlns:cx="http://schemas.microsoft.com/office/drawing/2014/chartex" xmlns:cx1="http://schemas.microsoft.com/office/drawing/2015/9/8/chartex" xmlns:cx2="http://schemas.microsoft.com/office/drawing/2015/10/21/chartex" xmlns:cx3="http://schemas.microsoft.com/office/drawing/2016/5/9/chartex" xmlns:cx4="http://schemas.microsoft.com/office/drawing/2016/5/10/chartex" xmlns:cx5="http://schemas.microsoft.com/office/drawing/2016/5/11/chartex" xmlns:cx6="http://schemas.microsoft.com/office/drawing/2016/5/12/chartex" xmlns:cx7="http://schemas.microsoft.com/office/drawing/2016/5/13/chartex" xmlns:cx8="http://schemas.microsoft.com/office/drawing/2016/5/14/chartex" xmlns:mc="http://schemas.openxmlformats.org/markup-compatibility/2006" xmlns:aink="http://schemas.microsoft.com/office/drawing/2016/ink" xmlns:am3d="http://schemas.microsoft.com/office/drawing/2017/model3d" xmlns:o="urn:schemas-microsoft-com:office:office" xmlns:oel="http://schemas.microsoft.com/office/2019/extlst" xmlns:r="http://schemas.openxmlformats.org/officeDocument/2006/relationships" xmlns:m="http://schemas.openxmlformats.org/officeDocument/2006/math" xmlns:v="urn:schemas-microsoft-com:vml" xmlns:wp14="http://schemas.microsoft.com/office/word/2010/wordprocessingDrawing" xmlns:wp="http://schemas.openxmlformats.org/drawingml/2006/wordprocessingDrawing" xmlns:w10="urn:schemas-microsoft-com:office:word" xmlns:w="http://schemas.openxmlformats.org/wordprocessingml/2006/main" xmlns:w14="http://schemas.microsoft.com/office/word/2010/wordml" xmlns:w15="http://schemas.microsoft.com/office/word/2012/wordml" xmlns:w16cex="http://schemas.microsoft.com/office/word/2018/wordml/cex" xmlns:w16cid="http://schemas.microsoft.com/office/word/2016/wordml/cid" xmlns:w16="http://schemas.microsoft.com/office/word/2018/wordml" xmlns:w16du="http://schemas.microsoft.com/office/word/2023/wordml/word16du" xmlns:w16sdtdh="http://schemas.microsoft.com/office/word/2020/wordml/sdtdatahash" xmlns:w16sdtfl="http://schemas.microsoft.com/office/word/2024/wordml/sdtformatlock" xmlns:w16se="http://schemas.microsoft.com/office/word/2015/wordml/symex" xmlns:wpg="http://schemas.microsoft.com/office/word/2010/wordprocessingGroup" xmlns:wpi="http://schemas.microsoft.com/office/word/2010/wordprocessingInk" xmlns:wne="http://schemas.microsoft.com/office/word/2006/wordml" xmlns:wps="http://schemas.microsoft.com/office/word/2010/wordprocessingShape" mc:Ignorable="w14 w15 w16se w16cid w16 w16cex w16sdtdh w16sdtfl w16du wp14">
-  <w:comment w:id="1" w:author="Laura Sarif Rivera Sanabria" w:date="2025-10-27T15:10:00Z" w:initials="LR">
+  <w:comment w:id="2" w:author="Laura Sarif Rivera Sanabria" w:date="2025-10-27T15:10:00Z" w:initials="LR">
     <w:p>
       <w:pPr>
         <w:pStyle w:val="CommentText"/>
@@ -4385,7 +4677,7 @@
       </w:r>
     </w:p>
   </w:comment>
-  <w:comment w:id="2" w:author="Maria Camila Caraballo" w:date="2025-10-27T14:12:00Z" w:initials="MC">
+  <w:comment w:id="3" w:author="Maria Camila Caraballo" w:date="2025-10-27T14:12:00Z" w:initials="MC">
     <w:p>
       <w:pPr>
         <w:pStyle w:val="CommentText"/>
@@ -4402,7 +4694,7 @@
       </w:r>
     </w:p>
   </w:comment>
-  <w:comment w:id="3" w:author="Laura Sarif Rivera Sanabria" w:date="2025-10-28T15:48:00Z" w:initials="LR">
+  <w:comment w:id="4" w:author="Laura Sarif Rivera Sanabria" w:date="2025-10-28T15:48:00Z" w:initials="LR">
     <w:p>
       <w:pPr>
         <w:pStyle w:val="CommentText"/>
@@ -4419,7 +4711,7 @@
       </w:r>
     </w:p>
   </w:comment>
-  <w:comment w:id="4" w:author="Maria Camila Caraballo" w:date="2025-10-30T21:54:00Z" w:initials="MC">
+  <w:comment w:id="5" w:author="Maria Camila Caraballo" w:date="2025-10-30T21:54:00Z" w:initials="MC">
     <w:p>
       <w:pPr>
         <w:pStyle w:val="CommentText"/>
@@ -4436,7 +4728,7 @@
       </w:r>
     </w:p>
   </w:comment>
-  <w:comment w:id="5" w:author="Javier Antonio Amaya Nieto" w:date="2025-10-29T22:22:00Z" w:initials="JAAN">
+  <w:comment w:id="6" w:author="Javier Antonio Amaya Nieto" w:date="2025-10-29T22:22:00Z" w:initials="JAAN">
     <w:p>
       <w:pPr>
         <w:pStyle w:val="ListParagraph"/>
@@ -4501,7 +4793,7 @@
       </w:pPr>
     </w:p>
   </w:comment>
-  <w:comment w:id="6" w:author="Javier Antonio Amaya Nieto" w:date="2025-10-29T22:31:00Z" w:initials="JAAN">
+  <w:comment w:id="7" w:author="Javier Antonio Amaya Nieto" w:date="2025-10-29T22:31:00Z" w:initials="JAAN">
     <w:p>
       <w:pPr>
         <w:pStyle w:val="ListParagraph"/>
@@ -4574,161 +4866,6 @@
       <w:pPr>
         <w:pStyle w:val="CommentText"/>
       </w:pPr>
-    </w:p>
-  </w:comment>
-  <w:comment w:id="7" w:author="Maria Camila Caraballo" w:date="2025-10-27T14:17:00Z" w:initials="MC">
-    <w:p>
-      <w:pPr>
-        <w:pStyle w:val="CommentText"/>
-        <w:jc w:val="left"/>
-      </w:pPr>
-      <w:r>
-        <w:rPr>
-          <w:rStyle w:val="CommentReference"/>
-        </w:rPr>
-        <w:annotationRef/>
-      </w:r>
-      <w:r>
-        <w:fldChar w:fldCharType="begin"/>
-      </w:r>
-      <w:r>
-        <w:instrText>HYPERLINK "mailto:mc.caraballo@uniandes.edu.co"</w:instrText>
-      </w:r>
-      <w:bookmarkStart w:id="8" w:name="_@_C9EDABD702E8450ABB4D83DDD1679BDBZ"/>
-      <w:r>
-        <w:fldChar w:fldCharType="separate"/>
-      </w:r>
-      <w:bookmarkEnd w:id="8"/>
-      <w:r>
-        <w:rPr>
-          <w:rStyle w:val="Mention"/>
-          <w:noProof/>
-        </w:rPr>
-        <w:t>@Maria Camila Caraballo</w:t>
-      </w:r>
-      <w:r>
-        <w:fldChar w:fldCharType="end"/>
-      </w:r>
-      <w:r>
-        <w:t xml:space="preserve"> Interpretación de los resultados de acuerdo con la sección de pruebas de hipótesis hechas por </w:t>
-      </w:r>
-      <w:r>
-        <w:fldChar w:fldCharType="begin"/>
-      </w:r>
-      <w:r>
-        <w:instrText>HYPERLINK "mailto:j.amayan@uniandes.edu.co"</w:instrText>
-      </w:r>
-      <w:bookmarkStart w:id="9" w:name="_@_D672EBF210164869B7E0D1034AD4814DZ"/>
-      <w:r>
-        <w:fldChar w:fldCharType="separate"/>
-      </w:r>
-      <w:bookmarkEnd w:id="9"/>
-      <w:r>
-        <w:rPr>
-          <w:rStyle w:val="Mention"/>
-          <w:noProof/>
-        </w:rPr>
-        <w:t>@Javier Antonio Amaya Nieto</w:t>
-      </w:r>
-      <w:r>
-        <w:fldChar w:fldCharType="end"/>
-      </w:r>
-      <w:r>
-        <w:t xml:space="preserve"> </w:t>
-      </w:r>
-    </w:p>
-  </w:comment>
-  <w:comment w:id="10" w:author="Maria Camila Caraballo" w:date="2025-10-27T14:19:00Z" w:initials="MC">
-    <w:p>
-      <w:pPr>
-        <w:pStyle w:val="CommentText"/>
-        <w:jc w:val="left"/>
-      </w:pPr>
-      <w:r>
-        <w:rPr>
-          <w:rStyle w:val="CommentReference"/>
-        </w:rPr>
-        <w:annotationRef/>
-      </w:r>
-      <w:r>
-        <w:t xml:space="preserve">Creación de las visualizaciones de los resultados para poder dar respuesta a la pregunta planteada. Asegurarse de que en los gráficos se puedan observar intervalos de confianza </w:t>
-      </w:r>
-    </w:p>
-  </w:comment>
-  <w:comment w:id="11" w:author="Maria Camila Caraballo" w:date="2025-10-27T14:20:00Z" w:initials="MC">
-    <w:p>
-      <w:pPr>
-        <w:pStyle w:val="CommentText"/>
-        <w:jc w:val="left"/>
-      </w:pPr>
-      <w:r>
-        <w:rPr>
-          <w:rStyle w:val="CommentReference"/>
-        </w:rPr>
-        <w:annotationRef/>
-      </w:r>
-      <w:r>
-        <w:fldChar w:fldCharType="begin"/>
-      </w:r>
-      <w:r>
-        <w:instrText>HYPERLINK "mailto:mc.caraballo@uniandes.edu.co"</w:instrText>
-      </w:r>
-      <w:bookmarkStart w:id="12" w:name="_@_A7E2F23AE6CA4A9D80D35680BF0B268CZ"/>
-      <w:r>
-        <w:fldChar w:fldCharType="separate"/>
-      </w:r>
-      <w:bookmarkEnd w:id="12"/>
-      <w:r>
-        <w:rPr>
-          <w:rStyle w:val="Mention"/>
-          <w:noProof/>
-        </w:rPr>
-        <w:t>@Maria Camila Caraballo</w:t>
-      </w:r>
-      <w:r>
-        <w:fldChar w:fldCharType="end"/>
-      </w:r>
-      <w:r>
-        <w:t xml:space="preserve"> Nosotros damos respuesta a la pregunta planteada con la coherencia argumentativa que piden y las conclusiones finales de lo que encontramos y pudimos validar del método empírico</w:t>
-      </w:r>
-    </w:p>
-  </w:comment>
-  <w:comment w:id="13" w:author="Maria Camila Caraballo" w:date="2025-10-27T14:21:00Z" w:initials="MC">
-    <w:p>
-      <w:pPr>
-        <w:pStyle w:val="CommentText"/>
-        <w:jc w:val="left"/>
-      </w:pPr>
-      <w:r>
-        <w:rPr>
-          <w:rStyle w:val="CommentReference"/>
-        </w:rPr>
-        <w:annotationRef/>
-      </w:r>
-      <w:r>
-        <w:fldChar w:fldCharType="begin"/>
-      </w:r>
-      <w:r>
-        <w:instrText>HYPERLINK "mailto:ls.riveras1@uniandes.edu.co"</w:instrText>
-      </w:r>
-      <w:bookmarkStart w:id="14" w:name="_@_C3483D689CE747C8B1D7F1BF0FE90401Z"/>
-      <w:r>
-        <w:fldChar w:fldCharType="separate"/>
-      </w:r>
-      <w:bookmarkEnd w:id="14"/>
-      <w:r>
-        <w:rPr>
-          <w:rStyle w:val="Mention"/>
-          <w:noProof/>
-        </w:rPr>
-        <w:t>@Laura Sarif Rivera Sanabria</w:t>
-      </w:r>
-      <w:r>
-        <w:fldChar w:fldCharType="end"/>
-      </w:r>
-      <w:r>
-        <w:t xml:space="preserve"> Redacción de los ajustes realizados a partir de la retroalimentación recibida en su totalidad </w:t>
-      </w:r>
     </w:p>
   </w:comment>
 </w:comments>
@@ -4742,10 +4879,6 @@
   <w15:commentEx w15:paraId="47BA9AD8" w15:paraIdParent="1FA4CA1E" w15:done="0"/>
   <w15:commentEx w15:paraId="75D0F37E" w15:done="0"/>
   <w15:commentEx w15:paraId="1DB4A398" w15:done="0"/>
-  <w15:commentEx w15:paraId="487C4F4D" w15:done="0"/>
-  <w15:commentEx w15:paraId="218E314B" w15:done="1"/>
-  <w15:commentEx w15:paraId="3CD338B0" w15:done="0"/>
-  <w15:commentEx w15:paraId="13E40681" w15:done="0"/>
 </w15:commentsEx>
 </file>
 
@@ -4757,22 +4890,6 @@
   <w16cex:commentExtensible w16cex:durableId="2B7F91A2" w16cex:dateUtc="2025-10-31T02:54:00Z"/>
   <w16cex:commentExtensible w16cex:durableId="2CAD1220" w16cex:dateUtc="2025-10-30T03:22:00Z"/>
   <w16cex:commentExtensible w16cex:durableId="2CAD1455" w16cex:dateUtc="2025-10-30T03:31:00Z"/>
-  <w16cex:commentExtensible w16cex:durableId="3BC939F9" w16cex:dateUtc="2025-10-27T19:17:00Z"/>
-  <w16cex:commentExtensible w16cex:durableId="0CC358AB" w16cex:dateUtc="2025-10-27T19:19:00Z"/>
-  <w16cex:commentExtensible w16cex:durableId="4CBB1290" w16cex:dateUtc="2025-10-27T19:20:00Z"/>
-  <w16cex:commentExtensible w16cex:durableId="26935887" w16cex:dateUtc="2025-10-27T19:21:00Z">
-    <w16cex:extLst>
-      <w16:ext w16:uri="{CE6994B0-6A32-4C9F-8C6B-6E91EDA988CE}">
-        <cr:reactions xmlns:cr="http://schemas.microsoft.com/office/comments/2020/reactions">
-          <cr:reaction reactionType="1">
-            <cr:reactionInfo dateUtc="2025-10-31T03:33:47Z">
-              <cr:user userId="S::mc.caraballo@uniandes.edu.co::365928a4-ac9b-4cb7-8cff-0f2d693cc50f" userProvider="AD" userName="Maria Camila Caraballo"/>
-            </cr:reactionInfo>
-          </cr:reaction>
-        </cr:reactions>
-      </w16:ext>
-    </w16cex:extLst>
-  </w16cex:commentExtensible>
 </w16cex:commentsExtensible>
 </file>
 
@@ -4784,10 +4901,6 @@
   <w16cid:commentId w16cid:paraId="47BA9AD8" w16cid:durableId="2B7F91A2"/>
   <w16cid:commentId w16cid:paraId="75D0F37E" w16cid:durableId="2CAD1220"/>
   <w16cid:commentId w16cid:paraId="1DB4A398" w16cid:durableId="2CAD1455"/>
-  <w16cid:commentId w16cid:paraId="487C4F4D" w16cid:durableId="3BC939F9"/>
-  <w16cid:commentId w16cid:paraId="218E314B" w16cid:durableId="0CC358AB"/>
-  <w16cid:commentId w16cid:paraId="3CD338B0" w16cid:durableId="4CBB1290"/>
-  <w16cid:commentId w16cid:paraId="13E40681" w16cid:durableId="26935887"/>
 </w16cid:commentsIds>
 </file>
 
@@ -7006,7 +7119,7 @@
   <w:style w:type="paragraph" w:default="1" w:styleId="Normal">
     <w:name w:val="Normal"/>
     <w:qFormat/>
-    <w:rsid w:val="00470DC2"/>
+    <w:rsid w:val="005701C2"/>
     <w:pPr>
       <w:spacing w:before="100" w:beforeAutospacing="1" w:after="100" w:afterAutospacing="1" w:line="240" w:lineRule="auto"/>
       <w:jc w:val="both"/>
@@ -7243,7 +7356,6 @@
   <w:style w:type="character" w:default="1" w:styleId="DefaultParagraphFont">
     <w:name w:val="Default Paragraph Font"/>
     <w:uiPriority w:val="1"/>
-    <w:semiHidden/>
     <w:unhideWhenUsed/>
   </w:style>
   <w:style w:type="table" w:default="1" w:styleId="TableNormal">
@@ -7972,62 +8084,6 @@
 
 <file path=word/documenttasks/documenttasks1.xml><?xml version="1.0" encoding="utf-8"?>
 <t:Tasks xmlns:t="http://schemas.microsoft.com/office/tasks/2019/documenttasks" xmlns:oel="http://schemas.microsoft.com/office/2019/extlst">
-  <t:Task id="{BC2160F1-07A0-4CB4-9C01-F5CAD850468D}">
-    <t:Anchor>
-      <t:Comment id="1003043321"/>
-    </t:Anchor>
-    <t:History>
-      <t:Event id="{4E5B4D11-762F-4745-A81F-FA505F2A94FF}" time="2025-10-27T19:17:58.569Z">
-        <t:Attribution userId="S::mc.caraballo@uniandes.edu.co::365928a4-ac9b-4cb7-8cff-0f2d693cc50f" userProvider="AD" userName="Maria Camila Caraballo"/>
-        <t:Anchor>
-          <t:Comment id="1003043321"/>
-        </t:Anchor>
-        <t:Create/>
-      </t:Event>
-      <t:Event id="{37B700A3-BEA9-44FB-82BE-F019DF7C9117}" time="2025-10-27T19:17:58.569Z">
-        <t:Attribution userId="S::mc.caraballo@uniandes.edu.co::365928a4-ac9b-4cb7-8cff-0f2d693cc50f" userProvider="AD" userName="Maria Camila Caraballo"/>
-        <t:Anchor>
-          <t:Comment id="1003043321"/>
-        </t:Anchor>
-        <t:Assign userId="S::mc.caraballo@uniandes.edu.co::365928a4-ac9b-4cb7-8cff-0f2d693cc50f" userProvider="AD" userName="Maria Camila Caraballo"/>
-      </t:Event>
-      <t:Event id="{AB1A3C48-9F77-4276-B5FF-88FE9A975824}" time="2025-10-27T19:17:58.569Z">
-        <t:Attribution userId="S::mc.caraballo@uniandes.edu.co::365928a4-ac9b-4cb7-8cff-0f2d693cc50f" userProvider="AD" userName="Maria Camila Caraballo"/>
-        <t:Anchor>
-          <t:Comment id="1003043321"/>
-        </t:Anchor>
-        <t:SetTitle title="@Maria Camila Caraballo Interpretación de los resultados de acuerdo con la sección de pruebas de hipótesis hechas por @Javier Antonio Amaya Nieto "/>
-      </t:Event>
-    </t:History>
-  </t:Task>
-  <t:Task id="{DADF1DCE-3A61-4AF3-B41E-D55676DEF3DD}">
-    <t:Anchor>
-      <t:Comment id="647190663"/>
-    </t:Anchor>
-    <t:History>
-      <t:Event id="{B4DD7B07-7B34-4809-AC62-70CE67DCCE21}" time="2025-10-27T19:21:38.175Z">
-        <t:Attribution userId="S::mc.caraballo@uniandes.edu.co::365928a4-ac9b-4cb7-8cff-0f2d693cc50f" userProvider="AD" userName="Maria Camila Caraballo"/>
-        <t:Anchor>
-          <t:Comment id="647190663"/>
-        </t:Anchor>
-        <t:Create/>
-      </t:Event>
-      <t:Event id="{FA3DD39C-71FF-4F1E-BED3-4B553F33537C}" time="2025-10-27T19:21:38.175Z">
-        <t:Attribution userId="S::mc.caraballo@uniandes.edu.co::365928a4-ac9b-4cb7-8cff-0f2d693cc50f" userProvider="AD" userName="Maria Camila Caraballo"/>
-        <t:Anchor>
-          <t:Comment id="647190663"/>
-        </t:Anchor>
-        <t:Assign userId="S::ls.riveras1@uniandes.edu.co::3a82d5e1-3940-4519-a582-e3c6eeca778e" userProvider="AD" userName="Laura Sarif Rivera Sanabria"/>
-      </t:Event>
-      <t:Event id="{39A007CF-540F-4488-A585-DB7218CDB784}" time="2025-10-27T19:21:38.175Z">
-        <t:Attribution userId="S::mc.caraballo@uniandes.edu.co::365928a4-ac9b-4cb7-8cff-0f2d693cc50f" userProvider="AD" userName="Maria Camila Caraballo"/>
-        <t:Anchor>
-          <t:Comment id="647190663"/>
-        </t:Anchor>
-        <t:SetTitle title="@Laura Sarif Rivera Sanabria Redacción de los ajustes realizados a partir de la retroalimentación recibida en su totalidad "/>
-      </t:Event>
-    </t:History>
-  </t:Task>
   <t:Task id="{65D11562-2096-4E83-AB3F-CB9F730D2C32}">
     <t:Anchor>
       <t:Comment id="1184343662"/>
@@ -8056,34 +8112,6 @@
       </t:Event>
     </t:History>
   </t:Task>
-  <t:Task id="{9FEE0A99-38E5-4758-AF1D-76C18CFA451A}">
-    <t:Anchor>
-      <t:Comment id="1287328400"/>
-    </t:Anchor>
-    <t:History>
-      <t:Event id="{39C80951-A54A-49DE-89B6-43C69D6EA6BC}" time="2025-10-27T19:20:30.822Z">
-        <t:Attribution userId="S::mc.caraballo@uniandes.edu.co::365928a4-ac9b-4cb7-8cff-0f2d693cc50f" userProvider="AD" userName="Maria Camila Caraballo"/>
-        <t:Anchor>
-          <t:Comment id="1287328400"/>
-        </t:Anchor>
-        <t:Create/>
-      </t:Event>
-      <t:Event id="{8107174E-38EC-4028-8679-9036AE2AFD38}" time="2025-10-27T19:20:30.822Z">
-        <t:Attribution userId="S::mc.caraballo@uniandes.edu.co::365928a4-ac9b-4cb7-8cff-0f2d693cc50f" userProvider="AD" userName="Maria Camila Caraballo"/>
-        <t:Anchor>
-          <t:Comment id="1287328400"/>
-        </t:Anchor>
-        <t:Assign userId="S::j.amayan@uniandes.edu.co::bfb348bb-1668-4fde-8ac3-4578df8354e2" userProvider="AD" userName="Javier Antonio Amaya Nieto"/>
-      </t:Event>
-      <t:Event id="{835FF60E-EF75-46D9-BEEC-8F93595EC1EA}" time="2025-10-27T19:20:30.822Z">
-        <t:Attribution userId="S::mc.caraballo@uniandes.edu.co::365928a4-ac9b-4cb7-8cff-0f2d693cc50f" userProvider="AD" userName="Maria Camila Caraballo"/>
-        <t:Anchor>
-          <t:Comment id="1287328400"/>
-        </t:Anchor>
-        <t:SetTitle title="@Javier Antonio Amaya Nieto @Maria Camila Caraballo Nosotros damos respuesta a la pregunta planteada con la coherencia argumentativa que piden y las conclusiones finales de lo que encontramos y pudimos validar del método empírico"/>
-      </t:Event>
-    </t:History>
-  </t:Task>
   <t:Task id="{752F0703-FB98-41BD-910B-6DD75C2E9EDF}">
     <t:Anchor>
       <t:Comment id="1838929026"/>
@@ -8109,38 +8137,6 @@
           <t:Comment id="1838929026"/>
         </t:Anchor>
         <t:SetTitle title="@Maria Camila Caraballo Encargada de plantear la hipotesis respondiendo a estos tres puntos principales junto con la justificacion teorica del hecho estilizado"/>
-      </t:Event>
-    </t:History>
-  </t:Task>
-  <t:Task id="{0D58F171-A750-4F02-BC2B-0CA04898924A}">
-    <t:Anchor>
-      <t:Comment id="214128811"/>
-    </t:Anchor>
-    <t:History>
-      <t:Event id="{DB4A97AA-DFEA-421B-B3B7-46405382CD8D}" time="2025-10-27T19:19:05.251Z">
-        <t:Attribution userId="S::mc.caraballo@uniandes.edu.co::365928a4-ac9b-4cb7-8cff-0f2d693cc50f" userProvider="AD" userName="Maria Camila Caraballo"/>
-        <t:Anchor>
-          <t:Comment id="214128811"/>
-        </t:Anchor>
-        <t:Create/>
-      </t:Event>
-      <t:Event id="{B67BBB7D-C39A-46CB-94DA-A0CDBD2E4169}" time="2025-10-27T19:19:05.251Z">
-        <t:Attribution userId="S::mc.caraballo@uniandes.edu.co::365928a4-ac9b-4cb7-8cff-0f2d693cc50f" userProvider="AD" userName="Maria Camila Caraballo"/>
-        <t:Anchor>
-          <t:Comment id="214128811"/>
-        </t:Anchor>
-        <t:Assign userId="S::ls.riveras1@uniandes.edu.co::3a82d5e1-3940-4519-a582-e3c6eeca778e" userProvider="AD" userName="Laura Sarif Rivera Sanabria"/>
-      </t:Event>
-      <t:Event id="{C017BABA-BA86-47B6-BC26-1334CCA5C684}" time="2025-10-27T19:19:05.251Z">
-        <t:Attribution userId="S::mc.caraballo@uniandes.edu.co::365928a4-ac9b-4cb7-8cff-0f2d693cc50f" userProvider="AD" userName="Maria Camila Caraballo"/>
-        <t:Anchor>
-          <t:Comment id="214128811"/>
-        </t:Anchor>
-        <t:SetTitle title="@Laura Sarif Rivera Sanabria Creación de las visualizaciones de los resultados para poder dar respuesta a la pregunta planteada. Asegurarse de que en los gráficos se puedan observar intervalos de confianza "/>
-      </t:Event>
-      <t:Event id="{20E0F0B6-1121-4F72-AFE2-3C8FDD6DA51B}" time="2025-10-31T03:33:15.869Z">
-        <t:Attribution userId="S::mc.caraballo@uniandes.edu.co::365928a4-ac9b-4cb7-8cff-0f2d693cc50f" userProvider="AD" userName="Maria Camila Caraballo"/>
-        <t:Progress percentComplete="100"/>
       </t:Event>
     </t:History>
   </t:Task>
@@ -8476,12 +8472,256 @@
 </file>
 
 <file path=customXml/item2.xml><?xml version="1.0" encoding="utf-8"?>
-<?mso-contentType ?>
-<FormTemplates xmlns="http://schemas.microsoft.com/sharepoint/v3/contenttype/forms">
-  <Display>DocumentLibraryForm</Display>
-  <Edit>DocumentLibraryForm</Edit>
-  <New>DocumentLibraryForm</New>
-</FormTemplates>
+<ct:contentTypeSchema xmlns:ct="http://schemas.microsoft.com/office/2006/metadata/contentType" xmlns:ma="http://schemas.microsoft.com/office/2006/metadata/properties/metaAttributes" ct:_="" ma:_="" ma:contentTypeName="Documento" ma:contentTypeID="0x010100FDF0B3912B7D2344BBFABCC17A83C826" ma:contentTypeVersion="18" ma:contentTypeDescription="Crear nuevo documento." ma:contentTypeScope="" ma:versionID="8ebc0b984b0a9f096c8565c0fdb39ef1">
+  <xsd:schema xmlns:xsd="http://www.w3.org/2001/XMLSchema" xmlns:xs="http://www.w3.org/2001/XMLSchema" xmlns:p="http://schemas.microsoft.com/office/2006/metadata/properties" xmlns:ns3="407661db-69f6-48af-8192-3bef683ff284" xmlns:ns4="953ea1b5-9f77-44aa-be72-9ba04966663c" targetNamespace="http://schemas.microsoft.com/office/2006/metadata/properties" ma:root="true" ma:fieldsID="23a9c965938401fb64aeb2606a401683" ns3:_="" ns4:_="">
+    <xsd:import namespace="407661db-69f6-48af-8192-3bef683ff284"/>
+    <xsd:import namespace="953ea1b5-9f77-44aa-be72-9ba04966663c"/>
+    <xsd:element name="properties">
+      <xsd:complexType>
+        <xsd:sequence>
+          <xsd:element name="documentManagement">
+            <xsd:complexType>
+              <xsd:all>
+                <xsd:element ref="ns3:SharedWithUsers" minOccurs="0"/>
+                <xsd:element ref="ns3:SharedWithDetails" minOccurs="0"/>
+                <xsd:element ref="ns3:SharingHintHash" minOccurs="0"/>
+                <xsd:element ref="ns4:MediaServiceMetadata" minOccurs="0"/>
+                <xsd:element ref="ns4:MediaServiceFastMetadata" minOccurs="0"/>
+                <xsd:element ref="ns4:MediaServiceAutoKeyPoints" minOccurs="0"/>
+                <xsd:element ref="ns4:MediaServiceKeyPoints" minOccurs="0"/>
+                <xsd:element ref="ns4:MediaServiceDateTaken" minOccurs="0"/>
+                <xsd:element ref="ns4:MediaServiceObjectDetectorVersions" minOccurs="0"/>
+                <xsd:element ref="ns4:MediaServiceAutoTags" minOccurs="0"/>
+                <xsd:element ref="ns4:MediaLengthInSeconds" minOccurs="0"/>
+                <xsd:element ref="ns4:MediaServiceOCR" minOccurs="0"/>
+                <xsd:element ref="ns4:MediaServiceGenerationTime" minOccurs="0"/>
+                <xsd:element ref="ns4:MediaServiceEventHashCode" minOccurs="0"/>
+                <xsd:element ref="ns4:MediaServiceLocation" minOccurs="0"/>
+                <xsd:element ref="ns4:_activity" minOccurs="0"/>
+                <xsd:element ref="ns4:MediaServiceSearchProperties" minOccurs="0"/>
+                <xsd:element ref="ns4:MediaServiceSystemTags" minOccurs="0"/>
+              </xsd:all>
+            </xsd:complexType>
+          </xsd:element>
+        </xsd:sequence>
+      </xsd:complexType>
+    </xsd:element>
+  </xsd:schema>
+  <xsd:schema xmlns:xsd="http://www.w3.org/2001/XMLSchema" xmlns:xs="http://www.w3.org/2001/XMLSchema" xmlns:dms="http://schemas.microsoft.com/office/2006/documentManagement/types" xmlns:pc="http://schemas.microsoft.com/office/infopath/2007/PartnerControls" targetNamespace="407661db-69f6-48af-8192-3bef683ff284" elementFormDefault="qualified">
+    <xsd:import namespace="http://schemas.microsoft.com/office/2006/documentManagement/types"/>
+    <xsd:import namespace="http://schemas.microsoft.com/office/infopath/2007/PartnerControls"/>
+    <xsd:element name="SharedWithUsers" ma:index="8" nillable="true" ma:displayName="Compartido con" ma:description="" ma:internalName="SharedWithUsers" ma:readOnly="true">
+      <xsd:complexType>
+        <xsd:complexContent>
+          <xsd:extension base="dms:UserMulti">
+            <xsd:sequence>
+              <xsd:element name="UserInfo" minOccurs="0" maxOccurs="unbounded">
+                <xsd:complexType>
+                  <xsd:sequence>
+                    <xsd:element name="DisplayName" type="xsd:string" minOccurs="0"/>
+                    <xsd:element name="AccountId" type="dms:UserId" minOccurs="0" nillable="true"/>
+                    <xsd:element name="AccountType" type="xsd:string" minOccurs="0"/>
+                  </xsd:sequence>
+                </xsd:complexType>
+              </xsd:element>
+            </xsd:sequence>
+          </xsd:extension>
+        </xsd:complexContent>
+      </xsd:complexType>
+    </xsd:element>
+    <xsd:element name="SharedWithDetails" ma:index="9" nillable="true" ma:displayName="Detalles de uso compartido" ma:description="" ma:internalName="SharedWithDetails" ma:readOnly="true">
+      <xsd:simpleType>
+        <xsd:restriction base="dms:Note">
+          <xsd:maxLength value="255"/>
+        </xsd:restriction>
+      </xsd:simpleType>
+    </xsd:element>
+    <xsd:element name="SharingHintHash" ma:index="10" nillable="true" ma:displayName="Hash de la sugerencia para compartir" ma:description="" ma:hidden="true" ma:internalName="SharingHintHash" ma:readOnly="true">
+      <xsd:simpleType>
+        <xsd:restriction base="dms:Text"/>
+      </xsd:simpleType>
+    </xsd:element>
+  </xsd:schema>
+  <xsd:schema xmlns:xsd="http://www.w3.org/2001/XMLSchema" xmlns:xs="http://www.w3.org/2001/XMLSchema" xmlns:dms="http://schemas.microsoft.com/office/2006/documentManagement/types" xmlns:pc="http://schemas.microsoft.com/office/infopath/2007/PartnerControls" targetNamespace="953ea1b5-9f77-44aa-be72-9ba04966663c" elementFormDefault="qualified">
+    <xsd:import namespace="http://schemas.microsoft.com/office/2006/documentManagement/types"/>
+    <xsd:import namespace="http://schemas.microsoft.com/office/infopath/2007/PartnerControls"/>
+    <xsd:element name="MediaServiceMetadata" ma:index="11" nillable="true" ma:displayName="MediaServiceMetadata" ma:description="" ma:hidden="true" ma:internalName="MediaServiceMetadata" ma:readOnly="true">
+      <xsd:simpleType>
+        <xsd:restriction base="dms:Note"/>
+      </xsd:simpleType>
+    </xsd:element>
+    <xsd:element name="MediaServiceFastMetadata" ma:index="12" nillable="true" ma:displayName="MediaServiceFastMetadata" ma:description="" ma:hidden="true" ma:internalName="MediaServiceFastMetadata" ma:readOnly="true">
+      <xsd:simpleType>
+        <xsd:restriction base="dms:Note"/>
+      </xsd:simpleType>
+    </xsd:element>
+    <xsd:element name="MediaServiceAutoKeyPoints" ma:index="13" nillable="true" ma:displayName="MediaServiceAutoKeyPoints" ma:hidden="true" ma:internalName="MediaServiceAutoKeyPoints" ma:readOnly="true">
+      <xsd:simpleType>
+        <xsd:restriction base="dms:Note"/>
+      </xsd:simpleType>
+    </xsd:element>
+    <xsd:element name="MediaServiceKeyPoints" ma:index="14" nillable="true" ma:displayName="KeyPoints" ma:internalName="MediaServiceKeyPoints" ma:readOnly="true">
+      <xsd:simpleType>
+        <xsd:restriction base="dms:Note">
+          <xsd:maxLength value="255"/>
+        </xsd:restriction>
+      </xsd:simpleType>
+    </xsd:element>
+    <xsd:element name="MediaServiceDateTaken" ma:index="15" nillable="true" ma:displayName="MediaServiceDateTaken" ma:hidden="true" ma:indexed="true" ma:internalName="MediaServiceDateTaken" ma:readOnly="true">
+      <xsd:simpleType>
+        <xsd:restriction base="dms:Text"/>
+      </xsd:simpleType>
+    </xsd:element>
+    <xsd:element name="MediaServiceObjectDetectorVersions" ma:index="16" nillable="true" ma:displayName="MediaServiceObjectDetectorVersions" ma:hidden="true" ma:indexed="true" ma:internalName="MediaServiceObjectDetectorVersions" ma:readOnly="true">
+      <xsd:simpleType>
+        <xsd:restriction base="dms:Text"/>
+      </xsd:simpleType>
+    </xsd:element>
+    <xsd:element name="MediaServiceAutoTags" ma:index="17" nillable="true" ma:displayName="Tags" ma:internalName="MediaServiceAutoTags" ma:readOnly="true">
+      <xsd:simpleType>
+        <xsd:restriction base="dms:Text"/>
+      </xsd:simpleType>
+    </xsd:element>
+    <xsd:element name="MediaLengthInSeconds" ma:index="18" nillable="true" ma:displayName="MediaLengthInSeconds" ma:hidden="true" ma:internalName="MediaLengthInSeconds" ma:readOnly="true">
+      <xsd:simpleType>
+        <xsd:restriction base="dms:Unknown"/>
+      </xsd:simpleType>
+    </xsd:element>
+    <xsd:element name="MediaServiceOCR" ma:index="19" nillable="true" ma:displayName="Extracted Text" ma:internalName="MediaServiceOCR" ma:readOnly="true">
+      <xsd:simpleType>
+        <xsd:restriction base="dms:Note">
+          <xsd:maxLength value="255"/>
+        </xsd:restriction>
+      </xsd:simpleType>
+    </xsd:element>
+    <xsd:element name="MediaServiceGenerationTime" ma:index="20" nillable="true" ma:displayName="MediaServiceGenerationTime" ma:hidden="true" ma:internalName="MediaServiceGenerationTime" ma:readOnly="true">
+      <xsd:simpleType>
+        <xsd:restriction base="dms:Text"/>
+      </xsd:simpleType>
+    </xsd:element>
+    <xsd:element name="MediaServiceEventHashCode" ma:index="21" nillable="true" ma:displayName="MediaServiceEventHashCode" ma:hidden="true" ma:internalName="MediaServiceEventHashCode" ma:readOnly="true">
+      <xsd:simpleType>
+        <xsd:restriction base="dms:Text"/>
+      </xsd:simpleType>
+    </xsd:element>
+    <xsd:element name="MediaServiceLocation" ma:index="22" nillable="true" ma:displayName="Location" ma:indexed="true" ma:internalName="MediaServiceLocation" ma:readOnly="true">
+      <xsd:simpleType>
+        <xsd:restriction base="dms:Text"/>
+      </xsd:simpleType>
+    </xsd:element>
+    <xsd:element name="_activity" ma:index="23" nillable="true" ma:displayName="_activity" ma:hidden="true" ma:internalName="_activity">
+      <xsd:simpleType>
+        <xsd:restriction base="dms:Note"/>
+      </xsd:simpleType>
+    </xsd:element>
+    <xsd:element name="MediaServiceSearchProperties" ma:index="24" nillable="true" ma:displayName="MediaServiceSearchProperties" ma:hidden="true" ma:internalName="MediaServiceSearchProperties" ma:readOnly="true">
+      <xsd:simpleType>
+        <xsd:restriction base="dms:Note"/>
+      </xsd:simpleType>
+    </xsd:element>
+    <xsd:element name="MediaServiceSystemTags" ma:index="25" nillable="true" ma:displayName="MediaServiceSystemTags" ma:hidden="true" ma:internalName="MediaServiceSystemTags" ma:readOnly="true">
+      <xsd:simpleType>
+        <xsd:restriction base="dms:Note"/>
+      </xsd:simpleType>
+    </xsd:element>
+  </xsd:schema>
+  <xsd:schema xmlns="http://schemas.openxmlformats.org/package/2006/metadata/core-properties" xmlns:xsd="http://www.w3.org/2001/XMLSchema" xmlns:xsi="http://www.w3.org/2001/XMLSchema-instance" xmlns:dc="http://purl.org/dc/elements/1.1/" xmlns:dcterms="http://purl.org/dc/terms/" xmlns:odoc="http://schemas.microsoft.com/internal/obd" targetNamespace="http://schemas.openxmlformats.org/package/2006/metadata/core-properties" elementFormDefault="qualified" attributeFormDefault="unqualified" blockDefault="#all">
+    <xsd:import namespace="http://purl.org/dc/elements/1.1/" schemaLocation="http://dublincore.org/schemas/xmls/qdc/2003/04/02/dc.xsd"/>
+    <xsd:import namespace="http://purl.org/dc/terms/" schemaLocation="http://dublincore.org/schemas/xmls/qdc/2003/04/02/dcterms.xsd"/>
+    <xsd:element name="coreProperties" type="CT_coreProperties"/>
+    <xsd:complexType name="CT_coreProperties">
+      <xsd:all>
+        <xsd:element ref="dc:creator" minOccurs="0" maxOccurs="1"/>
+        <xsd:element ref="dcterms:created" minOccurs="0" maxOccurs="1"/>
+        <xsd:element ref="dc:identifier" minOccurs="0" maxOccurs="1"/>
+        <xsd:element name="contentType" minOccurs="0" maxOccurs="1" type="xsd:string" ma:index="0" ma:displayName="Tipo de contenido"/>
+        <xsd:element ref="dc:title" minOccurs="0" maxOccurs="1" ma:index="4" ma:displayName="Título"/>
+        <xsd:element ref="dc:subject" minOccurs="0" maxOccurs="1"/>
+        <xsd:element ref="dc:description" minOccurs="0" maxOccurs="1"/>
+        <xsd:element name="keywords" minOccurs="0" maxOccurs="1" type="xsd:string"/>
+        <xsd:element ref="dc:language" minOccurs="0" maxOccurs="1"/>
+        <xsd:element name="category" minOccurs="0" maxOccurs="1" type="xsd:string"/>
+        <xsd:element name="version" minOccurs="0" maxOccurs="1" type="xsd:string"/>
+        <xsd:element name="revision" minOccurs="0" maxOccurs="1" type="xsd:string">
+          <xsd:annotation>
+            <xsd:documentation>
+                        This value indicates the number of saves or revisions. The application is responsible for updating this value after each revision.
+                    </xsd:documentation>
+          </xsd:annotation>
+        </xsd:element>
+        <xsd:element name="lastModifiedBy" minOccurs="0" maxOccurs="1" type="xsd:string"/>
+        <xsd:element ref="dcterms:modified" minOccurs="0" maxOccurs="1"/>
+        <xsd:element name="contentStatus" minOccurs="0" maxOccurs="1" type="xsd:string"/>
+      </xsd:all>
+    </xsd:complexType>
+  </xsd:schema>
+  <xs:schema xmlns:pc="http://schemas.microsoft.com/office/infopath/2007/PartnerControls" xmlns:xs="http://www.w3.org/2001/XMLSchema" targetNamespace="http://schemas.microsoft.com/office/infopath/2007/PartnerControls" elementFormDefault="qualified" attributeFormDefault="unqualified">
+    <xs:element name="Person">
+      <xs:complexType>
+        <xs:sequence>
+          <xs:element ref="pc:DisplayName" minOccurs="0"/>
+          <xs:element ref="pc:AccountId" minOccurs="0"/>
+          <xs:element ref="pc:AccountType" minOccurs="0"/>
+        </xs:sequence>
+      </xs:complexType>
+    </xs:element>
+    <xs:element name="DisplayName" type="xs:string"/>
+    <xs:element name="AccountId" type="xs:string"/>
+    <xs:element name="AccountType" type="xs:string"/>
+    <xs:element name="BDCAssociatedEntity">
+      <xs:complexType>
+        <xs:sequence>
+          <xs:element ref="pc:BDCEntity" minOccurs="0" maxOccurs="unbounded"/>
+        </xs:sequence>
+        <xs:attribute ref="pc:EntityNamespace"/>
+        <xs:attribute ref="pc:EntityName"/>
+        <xs:attribute ref="pc:SystemInstanceName"/>
+        <xs:attribute ref="pc:AssociationName"/>
+      </xs:complexType>
+    </xs:element>
+    <xs:attribute name="EntityNamespace" type="xs:string"/>
+    <xs:attribute name="EntityName" type="xs:string"/>
+    <xs:attribute name="SystemInstanceName" type="xs:string"/>
+    <xs:attribute name="AssociationName" type="xs:string"/>
+    <xs:element name="BDCEntity">
+      <xs:complexType>
+        <xs:sequence>
+          <xs:element ref="pc:EntityDisplayName" minOccurs="0"/>
+          <xs:element ref="pc:EntityInstanceReference" minOccurs="0"/>
+          <xs:element ref="pc:EntityId1" minOccurs="0"/>
+          <xs:element ref="pc:EntityId2" minOccurs="0"/>
+          <xs:element ref="pc:EntityId3" minOccurs="0"/>
+          <xs:element ref="pc:EntityId4" minOccurs="0"/>
+          <xs:element ref="pc:EntityId5" minOccurs="0"/>
+        </xs:sequence>
+      </xs:complexType>
+    </xs:element>
+    <xs:element name="EntityDisplayName" type="xs:string"/>
+    <xs:element name="EntityInstanceReference" type="xs:string"/>
+    <xs:element name="EntityId1" type="xs:string"/>
+    <xs:element name="EntityId2" type="xs:string"/>
+    <xs:element name="EntityId3" type="xs:string"/>
+    <xs:element name="EntityId4" type="xs:string"/>
+    <xs:element name="EntityId5" type="xs:string"/>
+    <xs:element name="Terms">
+      <xs:complexType>
+        <xs:sequence>
+          <xs:element ref="pc:TermInfo" minOccurs="0" maxOccurs="unbounded"/>
+        </xs:sequence>
+      </xs:complexType>
+    </xs:element>
+    <xs:element name="TermInfo">
+      <xs:complexType>
+        <xs:sequence>
+          <xs:element ref="pc:TermName" minOccurs="0"/>
+          <xs:element ref="pc:TermId" minOccurs="0"/>
+        </xs:sequence>
+      </xs:complexType>
+    </xs:element>
+    <xs:element name="TermName" type="xs:string"/>
+    <xs:element name="TermId" type="xs:string"/>
+  </xs:schema>
+</ct:contentTypeSchema>
 </file>
 
 <file path=customXml/item3.xml><?xml version="1.0" encoding="utf-8"?>
@@ -8787,256 +9027,12 @@
 </file>
 
 <file path=customXml/item4.xml><?xml version="1.0" encoding="utf-8"?>
-<ct:contentTypeSchema xmlns:ct="http://schemas.microsoft.com/office/2006/metadata/contentType" xmlns:ma="http://schemas.microsoft.com/office/2006/metadata/properties/metaAttributes" ct:_="" ma:_="" ma:contentTypeName="Documento" ma:contentTypeID="0x010100FDF0B3912B7D2344BBFABCC17A83C826" ma:contentTypeVersion="18" ma:contentTypeDescription="Crear nuevo documento." ma:contentTypeScope="" ma:versionID="8ebc0b984b0a9f096c8565c0fdb39ef1">
-  <xsd:schema xmlns:xsd="http://www.w3.org/2001/XMLSchema" xmlns:xs="http://www.w3.org/2001/XMLSchema" xmlns:p="http://schemas.microsoft.com/office/2006/metadata/properties" xmlns:ns3="407661db-69f6-48af-8192-3bef683ff284" xmlns:ns4="953ea1b5-9f77-44aa-be72-9ba04966663c" targetNamespace="http://schemas.microsoft.com/office/2006/metadata/properties" ma:root="true" ma:fieldsID="23a9c965938401fb64aeb2606a401683" ns3:_="" ns4:_="">
-    <xsd:import namespace="407661db-69f6-48af-8192-3bef683ff284"/>
-    <xsd:import namespace="953ea1b5-9f77-44aa-be72-9ba04966663c"/>
-    <xsd:element name="properties">
-      <xsd:complexType>
-        <xsd:sequence>
-          <xsd:element name="documentManagement">
-            <xsd:complexType>
-              <xsd:all>
-                <xsd:element ref="ns3:SharedWithUsers" minOccurs="0"/>
-                <xsd:element ref="ns3:SharedWithDetails" minOccurs="0"/>
-                <xsd:element ref="ns3:SharingHintHash" minOccurs="0"/>
-                <xsd:element ref="ns4:MediaServiceMetadata" minOccurs="0"/>
-                <xsd:element ref="ns4:MediaServiceFastMetadata" minOccurs="0"/>
-                <xsd:element ref="ns4:MediaServiceAutoKeyPoints" minOccurs="0"/>
-                <xsd:element ref="ns4:MediaServiceKeyPoints" minOccurs="0"/>
-                <xsd:element ref="ns4:MediaServiceDateTaken" minOccurs="0"/>
-                <xsd:element ref="ns4:MediaServiceObjectDetectorVersions" minOccurs="0"/>
-                <xsd:element ref="ns4:MediaServiceAutoTags" minOccurs="0"/>
-                <xsd:element ref="ns4:MediaLengthInSeconds" minOccurs="0"/>
-                <xsd:element ref="ns4:MediaServiceOCR" minOccurs="0"/>
-                <xsd:element ref="ns4:MediaServiceGenerationTime" minOccurs="0"/>
-                <xsd:element ref="ns4:MediaServiceEventHashCode" minOccurs="0"/>
-                <xsd:element ref="ns4:MediaServiceLocation" minOccurs="0"/>
-                <xsd:element ref="ns4:_activity" minOccurs="0"/>
-                <xsd:element ref="ns4:MediaServiceSearchProperties" minOccurs="0"/>
-                <xsd:element ref="ns4:MediaServiceSystemTags" minOccurs="0"/>
-              </xsd:all>
-            </xsd:complexType>
-          </xsd:element>
-        </xsd:sequence>
-      </xsd:complexType>
-    </xsd:element>
-  </xsd:schema>
-  <xsd:schema xmlns:xsd="http://www.w3.org/2001/XMLSchema" xmlns:xs="http://www.w3.org/2001/XMLSchema" xmlns:dms="http://schemas.microsoft.com/office/2006/documentManagement/types" xmlns:pc="http://schemas.microsoft.com/office/infopath/2007/PartnerControls" targetNamespace="407661db-69f6-48af-8192-3bef683ff284" elementFormDefault="qualified">
-    <xsd:import namespace="http://schemas.microsoft.com/office/2006/documentManagement/types"/>
-    <xsd:import namespace="http://schemas.microsoft.com/office/infopath/2007/PartnerControls"/>
-    <xsd:element name="SharedWithUsers" ma:index="8" nillable="true" ma:displayName="Compartido con" ma:description="" ma:internalName="SharedWithUsers" ma:readOnly="true">
-      <xsd:complexType>
-        <xsd:complexContent>
-          <xsd:extension base="dms:UserMulti">
-            <xsd:sequence>
-              <xsd:element name="UserInfo" minOccurs="0" maxOccurs="unbounded">
-                <xsd:complexType>
-                  <xsd:sequence>
-                    <xsd:element name="DisplayName" type="xsd:string" minOccurs="0"/>
-                    <xsd:element name="AccountId" type="dms:UserId" minOccurs="0" nillable="true"/>
-                    <xsd:element name="AccountType" type="xsd:string" minOccurs="0"/>
-                  </xsd:sequence>
-                </xsd:complexType>
-              </xsd:element>
-            </xsd:sequence>
-          </xsd:extension>
-        </xsd:complexContent>
-      </xsd:complexType>
-    </xsd:element>
-    <xsd:element name="SharedWithDetails" ma:index="9" nillable="true" ma:displayName="Detalles de uso compartido" ma:description="" ma:internalName="SharedWithDetails" ma:readOnly="true">
-      <xsd:simpleType>
-        <xsd:restriction base="dms:Note">
-          <xsd:maxLength value="255"/>
-        </xsd:restriction>
-      </xsd:simpleType>
-    </xsd:element>
-    <xsd:element name="SharingHintHash" ma:index="10" nillable="true" ma:displayName="Hash de la sugerencia para compartir" ma:description="" ma:hidden="true" ma:internalName="SharingHintHash" ma:readOnly="true">
-      <xsd:simpleType>
-        <xsd:restriction base="dms:Text"/>
-      </xsd:simpleType>
-    </xsd:element>
-  </xsd:schema>
-  <xsd:schema xmlns:xsd="http://www.w3.org/2001/XMLSchema" xmlns:xs="http://www.w3.org/2001/XMLSchema" xmlns:dms="http://schemas.microsoft.com/office/2006/documentManagement/types" xmlns:pc="http://schemas.microsoft.com/office/infopath/2007/PartnerControls" targetNamespace="953ea1b5-9f77-44aa-be72-9ba04966663c" elementFormDefault="qualified">
-    <xsd:import namespace="http://schemas.microsoft.com/office/2006/documentManagement/types"/>
-    <xsd:import namespace="http://schemas.microsoft.com/office/infopath/2007/PartnerControls"/>
-    <xsd:element name="MediaServiceMetadata" ma:index="11" nillable="true" ma:displayName="MediaServiceMetadata" ma:description="" ma:hidden="true" ma:internalName="MediaServiceMetadata" ma:readOnly="true">
-      <xsd:simpleType>
-        <xsd:restriction base="dms:Note"/>
-      </xsd:simpleType>
-    </xsd:element>
-    <xsd:element name="MediaServiceFastMetadata" ma:index="12" nillable="true" ma:displayName="MediaServiceFastMetadata" ma:description="" ma:hidden="true" ma:internalName="MediaServiceFastMetadata" ma:readOnly="true">
-      <xsd:simpleType>
-        <xsd:restriction base="dms:Note"/>
-      </xsd:simpleType>
-    </xsd:element>
-    <xsd:element name="MediaServiceAutoKeyPoints" ma:index="13" nillable="true" ma:displayName="MediaServiceAutoKeyPoints" ma:hidden="true" ma:internalName="MediaServiceAutoKeyPoints" ma:readOnly="true">
-      <xsd:simpleType>
-        <xsd:restriction base="dms:Note"/>
-      </xsd:simpleType>
-    </xsd:element>
-    <xsd:element name="MediaServiceKeyPoints" ma:index="14" nillable="true" ma:displayName="KeyPoints" ma:internalName="MediaServiceKeyPoints" ma:readOnly="true">
-      <xsd:simpleType>
-        <xsd:restriction base="dms:Note">
-          <xsd:maxLength value="255"/>
-        </xsd:restriction>
-      </xsd:simpleType>
-    </xsd:element>
-    <xsd:element name="MediaServiceDateTaken" ma:index="15" nillable="true" ma:displayName="MediaServiceDateTaken" ma:hidden="true" ma:indexed="true" ma:internalName="MediaServiceDateTaken" ma:readOnly="true">
-      <xsd:simpleType>
-        <xsd:restriction base="dms:Text"/>
-      </xsd:simpleType>
-    </xsd:element>
-    <xsd:element name="MediaServiceObjectDetectorVersions" ma:index="16" nillable="true" ma:displayName="MediaServiceObjectDetectorVersions" ma:hidden="true" ma:indexed="true" ma:internalName="MediaServiceObjectDetectorVersions" ma:readOnly="true">
-      <xsd:simpleType>
-        <xsd:restriction base="dms:Text"/>
-      </xsd:simpleType>
-    </xsd:element>
-    <xsd:element name="MediaServiceAutoTags" ma:index="17" nillable="true" ma:displayName="Tags" ma:internalName="MediaServiceAutoTags" ma:readOnly="true">
-      <xsd:simpleType>
-        <xsd:restriction base="dms:Text"/>
-      </xsd:simpleType>
-    </xsd:element>
-    <xsd:element name="MediaLengthInSeconds" ma:index="18" nillable="true" ma:displayName="MediaLengthInSeconds" ma:hidden="true" ma:internalName="MediaLengthInSeconds" ma:readOnly="true">
-      <xsd:simpleType>
-        <xsd:restriction base="dms:Unknown"/>
-      </xsd:simpleType>
-    </xsd:element>
-    <xsd:element name="MediaServiceOCR" ma:index="19" nillable="true" ma:displayName="Extracted Text" ma:internalName="MediaServiceOCR" ma:readOnly="true">
-      <xsd:simpleType>
-        <xsd:restriction base="dms:Note">
-          <xsd:maxLength value="255"/>
-        </xsd:restriction>
-      </xsd:simpleType>
-    </xsd:element>
-    <xsd:element name="MediaServiceGenerationTime" ma:index="20" nillable="true" ma:displayName="MediaServiceGenerationTime" ma:hidden="true" ma:internalName="MediaServiceGenerationTime" ma:readOnly="true">
-      <xsd:simpleType>
-        <xsd:restriction base="dms:Text"/>
-      </xsd:simpleType>
-    </xsd:element>
-    <xsd:element name="MediaServiceEventHashCode" ma:index="21" nillable="true" ma:displayName="MediaServiceEventHashCode" ma:hidden="true" ma:internalName="MediaServiceEventHashCode" ma:readOnly="true">
-      <xsd:simpleType>
-        <xsd:restriction base="dms:Text"/>
-      </xsd:simpleType>
-    </xsd:element>
-    <xsd:element name="MediaServiceLocation" ma:index="22" nillable="true" ma:displayName="Location" ma:indexed="true" ma:internalName="MediaServiceLocation" ma:readOnly="true">
-      <xsd:simpleType>
-        <xsd:restriction base="dms:Text"/>
-      </xsd:simpleType>
-    </xsd:element>
-    <xsd:element name="_activity" ma:index="23" nillable="true" ma:displayName="_activity" ma:hidden="true" ma:internalName="_activity">
-      <xsd:simpleType>
-        <xsd:restriction base="dms:Note"/>
-      </xsd:simpleType>
-    </xsd:element>
-    <xsd:element name="MediaServiceSearchProperties" ma:index="24" nillable="true" ma:displayName="MediaServiceSearchProperties" ma:hidden="true" ma:internalName="MediaServiceSearchProperties" ma:readOnly="true">
-      <xsd:simpleType>
-        <xsd:restriction base="dms:Note"/>
-      </xsd:simpleType>
-    </xsd:element>
-    <xsd:element name="MediaServiceSystemTags" ma:index="25" nillable="true" ma:displayName="MediaServiceSystemTags" ma:hidden="true" ma:internalName="MediaServiceSystemTags" ma:readOnly="true">
-      <xsd:simpleType>
-        <xsd:restriction base="dms:Note"/>
-      </xsd:simpleType>
-    </xsd:element>
-  </xsd:schema>
-  <xsd:schema xmlns="http://schemas.openxmlformats.org/package/2006/metadata/core-properties" xmlns:xsd="http://www.w3.org/2001/XMLSchema" xmlns:xsi="http://www.w3.org/2001/XMLSchema-instance" xmlns:dc="http://purl.org/dc/elements/1.1/" xmlns:dcterms="http://purl.org/dc/terms/" xmlns:odoc="http://schemas.microsoft.com/internal/obd" targetNamespace="http://schemas.openxmlformats.org/package/2006/metadata/core-properties" elementFormDefault="qualified" attributeFormDefault="unqualified" blockDefault="#all">
-    <xsd:import namespace="http://purl.org/dc/elements/1.1/" schemaLocation="http://dublincore.org/schemas/xmls/qdc/2003/04/02/dc.xsd"/>
-    <xsd:import namespace="http://purl.org/dc/terms/" schemaLocation="http://dublincore.org/schemas/xmls/qdc/2003/04/02/dcterms.xsd"/>
-    <xsd:element name="coreProperties" type="CT_coreProperties"/>
-    <xsd:complexType name="CT_coreProperties">
-      <xsd:all>
-        <xsd:element ref="dc:creator" minOccurs="0" maxOccurs="1"/>
-        <xsd:element ref="dcterms:created" minOccurs="0" maxOccurs="1"/>
-        <xsd:element ref="dc:identifier" minOccurs="0" maxOccurs="1"/>
-        <xsd:element name="contentType" minOccurs="0" maxOccurs="1" type="xsd:string" ma:index="0" ma:displayName="Tipo de contenido"/>
-        <xsd:element ref="dc:title" minOccurs="0" maxOccurs="1" ma:index="4" ma:displayName="Título"/>
-        <xsd:element ref="dc:subject" minOccurs="0" maxOccurs="1"/>
-        <xsd:element ref="dc:description" minOccurs="0" maxOccurs="1"/>
-        <xsd:element name="keywords" minOccurs="0" maxOccurs="1" type="xsd:string"/>
-        <xsd:element ref="dc:language" minOccurs="0" maxOccurs="1"/>
-        <xsd:element name="category" minOccurs="0" maxOccurs="1" type="xsd:string"/>
-        <xsd:element name="version" minOccurs="0" maxOccurs="1" type="xsd:string"/>
-        <xsd:element name="revision" minOccurs="0" maxOccurs="1" type="xsd:string">
-          <xsd:annotation>
-            <xsd:documentation>
-                        This value indicates the number of saves or revisions. The application is responsible for updating this value after each revision.
-                    </xsd:documentation>
-          </xsd:annotation>
-        </xsd:element>
-        <xsd:element name="lastModifiedBy" minOccurs="0" maxOccurs="1" type="xsd:string"/>
-        <xsd:element ref="dcterms:modified" minOccurs="0" maxOccurs="1"/>
-        <xsd:element name="contentStatus" minOccurs="0" maxOccurs="1" type="xsd:string"/>
-      </xsd:all>
-    </xsd:complexType>
-  </xsd:schema>
-  <xs:schema xmlns:pc="http://schemas.microsoft.com/office/infopath/2007/PartnerControls" xmlns:xs="http://www.w3.org/2001/XMLSchema" targetNamespace="http://schemas.microsoft.com/office/infopath/2007/PartnerControls" elementFormDefault="qualified" attributeFormDefault="unqualified">
-    <xs:element name="Person">
-      <xs:complexType>
-        <xs:sequence>
-          <xs:element ref="pc:DisplayName" minOccurs="0"/>
-          <xs:element ref="pc:AccountId" minOccurs="0"/>
-          <xs:element ref="pc:AccountType" minOccurs="0"/>
-        </xs:sequence>
-      </xs:complexType>
-    </xs:element>
-    <xs:element name="DisplayName" type="xs:string"/>
-    <xs:element name="AccountId" type="xs:string"/>
-    <xs:element name="AccountType" type="xs:string"/>
-    <xs:element name="BDCAssociatedEntity">
-      <xs:complexType>
-        <xs:sequence>
-          <xs:element ref="pc:BDCEntity" minOccurs="0" maxOccurs="unbounded"/>
-        </xs:sequence>
-        <xs:attribute ref="pc:EntityNamespace"/>
-        <xs:attribute ref="pc:EntityName"/>
-        <xs:attribute ref="pc:SystemInstanceName"/>
-        <xs:attribute ref="pc:AssociationName"/>
-      </xs:complexType>
-    </xs:element>
-    <xs:attribute name="EntityNamespace" type="xs:string"/>
-    <xs:attribute name="EntityName" type="xs:string"/>
-    <xs:attribute name="SystemInstanceName" type="xs:string"/>
-    <xs:attribute name="AssociationName" type="xs:string"/>
-    <xs:element name="BDCEntity">
-      <xs:complexType>
-        <xs:sequence>
-          <xs:element ref="pc:EntityDisplayName" minOccurs="0"/>
-          <xs:element ref="pc:EntityInstanceReference" minOccurs="0"/>
-          <xs:element ref="pc:EntityId1" minOccurs="0"/>
-          <xs:element ref="pc:EntityId2" minOccurs="0"/>
-          <xs:element ref="pc:EntityId3" minOccurs="0"/>
-          <xs:element ref="pc:EntityId4" minOccurs="0"/>
-          <xs:element ref="pc:EntityId5" minOccurs="0"/>
-        </xs:sequence>
-      </xs:complexType>
-    </xs:element>
-    <xs:element name="EntityDisplayName" type="xs:string"/>
-    <xs:element name="EntityInstanceReference" type="xs:string"/>
-    <xs:element name="EntityId1" type="xs:string"/>
-    <xs:element name="EntityId2" type="xs:string"/>
-    <xs:element name="EntityId3" type="xs:string"/>
-    <xs:element name="EntityId4" type="xs:string"/>
-    <xs:element name="EntityId5" type="xs:string"/>
-    <xs:element name="Terms">
-      <xs:complexType>
-        <xs:sequence>
-          <xs:element ref="pc:TermInfo" minOccurs="0" maxOccurs="unbounded"/>
-        </xs:sequence>
-      </xs:complexType>
-    </xs:element>
-    <xs:element name="TermInfo">
-      <xs:complexType>
-        <xs:sequence>
-          <xs:element ref="pc:TermName" minOccurs="0"/>
-          <xs:element ref="pc:TermId" minOccurs="0"/>
-        </xs:sequence>
-      </xs:complexType>
-    </xs:element>
-    <xs:element name="TermName" type="xs:string"/>
-    <xs:element name="TermId" type="xs:string"/>
-  </xs:schema>
-</ct:contentTypeSchema>
+<?mso-contentType ?>
+<FormTemplates xmlns="http://schemas.microsoft.com/sharepoint/v3/contenttype/forms">
+  <Display>DocumentLibraryForm</Display>
+  <Edit>DocumentLibraryForm</Edit>
+  <New>DocumentLibraryForm</New>
+</FormTemplates>
 </file>
 
 <file path=customXml/itemProps1.xml><?xml version="1.0" encoding="utf-8"?>
@@ -9050,22 +9046,6 @@
 </file>
 
 <file path=customXml/itemProps2.xml><?xml version="1.0" encoding="utf-8"?>
-<ds:datastoreItem xmlns:ds="http://schemas.openxmlformats.org/officeDocument/2006/customXml" ds:itemID="{6EC8ACFF-BCAF-4463-908E-F1BF04A93820}">
-  <ds:schemaRefs>
-    <ds:schemaRef ds:uri="http://schemas.microsoft.com/sharepoint/v3/contenttype/forms"/>
-  </ds:schemaRefs>
-</ds:datastoreItem>
-</file>
-
-<file path=customXml/itemProps3.xml><?xml version="1.0" encoding="utf-8"?>
-<ds:datastoreItem xmlns:ds="http://schemas.openxmlformats.org/officeDocument/2006/customXml" ds:itemID="{A262109D-7D23-451C-8BB0-3112A110FAD9}">
-  <ds:schemaRefs>
-    <ds:schemaRef ds:uri="http://schemas.openxmlformats.org/officeDocument/2006/bibliography"/>
-  </ds:schemaRefs>
-</ds:datastoreItem>
-</file>
-
-<file path=customXml/itemProps4.xml><?xml version="1.0" encoding="utf-8"?>
 <ds:datastoreItem xmlns:ds="http://schemas.openxmlformats.org/officeDocument/2006/customXml" ds:itemID="{1C35E1E7-D7D2-434A-BD09-CE3713ECD93D}">
   <ds:schemaRefs>
     <ds:schemaRef ds:uri="http://schemas.microsoft.com/office/2006/metadata/contentType"/>
@@ -9082,4 +9062,20 @@
     <ds:schemaRef ds:uri="http://schemas.microsoft.com/internal/obd"/>
   </ds:schemaRefs>
 </ds:datastoreItem>
+</file>
+
+<file path=customXml/itemProps3.xml><?xml version="1.0" encoding="utf-8"?>
+<ds:datastoreItem xmlns:ds="http://schemas.openxmlformats.org/officeDocument/2006/customXml" ds:itemID="{A262109D-7D23-451C-8BB0-3112A110FAD9}">
+  <ds:schemaRefs>
+    <ds:schemaRef ds:uri="http://schemas.openxmlformats.org/officeDocument/2006/bibliography"/>
+  </ds:schemaRefs>
+</ds:datastoreItem>
+</file>
+
+<file path=customXml/itemProps4.xml><?xml version="1.0" encoding="utf-8"?>
+<ds:datastoreItem xmlns:ds="http://schemas.openxmlformats.org/officeDocument/2006/customXml" ds:itemID="{6EC8ACFF-BCAF-4463-908E-F1BF04A93820}">
+  <ds:schemaRefs>
+    <ds:schemaRef ds:uri="http://schemas.microsoft.com/sharepoint/v3/contenttype/forms"/>
+  </ds:schemaRefs>
+</ds:datastoreItem>
 </file>
</xml_diff>